<commit_message>
Final submission tweaks: responsive header, min window size, release 25, updated readme
</commit_message>
<xml_diff>
--- a/readme.docx
+++ b/readme.docx
@@ -6,9 +6,28 @@
       <w:pPr>
         <w:pStyle w:val="Title"/>
         <w:spacing w:after="100"/>
-      </w:pPr>
-      <w:r>
-        <w:t>Guess Market – Exercise 2 (JavaFX)</w:t>
+        <w:jc w:val="center"/>
+        <w:rPr>
+          <w:rFonts w:asciiTheme="minorBidi" w:hAnsiTheme="minorBidi" w:cstheme="minorBidi"/>
+        </w:rPr>
+      </w:pPr>
+      <w:r>
+        <w:rPr>
+          <w:rFonts w:asciiTheme="minorBidi" w:hAnsiTheme="minorBidi" w:cstheme="minorBidi"/>
+        </w:rPr>
+        <w:t xml:space="preserve">Guess Market </w:t>
+      </w:r>
+      <w:r>
+        <w:rPr>
+          <w:rFonts w:asciiTheme="minorBidi" w:hAnsiTheme="minorBidi" w:cstheme="minorBidi"/>
+        </w:rPr>
+        <w:t>-</w:t>
+      </w:r>
+      <w:r>
+        <w:rPr>
+          <w:rFonts w:asciiTheme="minorBidi" w:hAnsiTheme="minorBidi" w:cstheme="minorBidi"/>
+        </w:rPr>
+        <w:t xml:space="preserve"> Exercise 2 (JavaFX)</w:t>
       </w:r>
     </w:p>
     <w:p>
@@ -30,7 +49,18 @@
           <w:sz w:val="24"/>
           <w:szCs w:val="24"/>
         </w:rPr>
-        <w:t>B</w:t>
+        <w:t>Bonuses that were implemented:</w:t>
+      </w:r>
+      <w:r>
+        <w:rPr>
+          <w:rFonts w:asciiTheme="minorHAnsi" w:hAnsiTheme="minorHAnsi" w:cstheme="minorBidi" w:hint="cs"/>
+          <w:b/>
+          <w:bCs/>
+          <w:sz w:val="24"/>
+          <w:szCs w:val="24"/>
+          <w:rtl/>
+        </w:rPr>
+        <w:t xml:space="preserve"> </w:t>
       </w:r>
       <w:r>
         <w:rPr>
@@ -40,68 +70,7 @@
           <w:sz w:val="24"/>
           <w:szCs w:val="24"/>
         </w:rPr>
-        <w:t>onus</w:t>
-      </w:r>
-      <w:r>
-        <w:rPr>
-          <w:rFonts w:asciiTheme="minorHAnsi" w:hAnsiTheme="minorHAnsi" w:cstheme="minorBidi"/>
-          <w:b/>
-          <w:bCs/>
-          <w:sz w:val="24"/>
-          <w:szCs w:val="24"/>
-        </w:rPr>
-        <w:t>es</w:t>
-      </w:r>
-      <w:r>
-        <w:rPr>
-          <w:rFonts w:asciiTheme="minorHAnsi" w:hAnsiTheme="minorHAnsi" w:cstheme="minorBidi"/>
-          <w:b/>
-          <w:bCs/>
-          <w:sz w:val="24"/>
-          <w:szCs w:val="24"/>
-        </w:rPr>
-        <w:t xml:space="preserve"> that </w:t>
-      </w:r>
-      <w:r>
-        <w:rPr>
-          <w:rFonts w:asciiTheme="minorHAnsi" w:hAnsiTheme="minorHAnsi" w:cstheme="minorBidi"/>
-          <w:b/>
-          <w:bCs/>
-          <w:sz w:val="24"/>
-          <w:szCs w:val="24"/>
-        </w:rPr>
-        <w:t>were</w:t>
-      </w:r>
-      <w:r>
-        <w:rPr>
-          <w:rFonts w:asciiTheme="minorHAnsi" w:hAnsiTheme="minorHAnsi" w:cstheme="minorBidi"/>
-          <w:b/>
-          <w:bCs/>
-          <w:sz w:val="24"/>
-          <w:szCs w:val="24"/>
-        </w:rPr>
-        <w:t xml:space="preserve"> implemented:</w:t>
-      </w:r>
-      <w:r>
-        <w:rPr>
-          <w:rFonts w:asciiTheme="minorHAnsi" w:hAnsiTheme="minorHAnsi" w:cstheme="minorBidi" w:hint="cs"/>
-          <w:b/>
-          <w:bCs/>
-          <w:sz w:val="24"/>
-          <w:szCs w:val="24"/>
-          <w:rtl/>
-        </w:rPr>
-        <w:t xml:space="preserve"> </w:t>
-      </w:r>
-      <w:r>
-        <w:rPr>
-          <w:rFonts w:asciiTheme="minorHAnsi" w:hAnsiTheme="minorHAnsi" w:cstheme="minorBidi"/>
-          <w:b/>
-          <w:bCs/>
-          <w:sz w:val="24"/>
-          <w:szCs w:val="24"/>
-        </w:rPr>
-        <w:t xml:space="preserve"> Skins, Animations, Create a new event.</w:t>
+        <w:t>Skins, Animations, Create a new event.</w:t>
       </w:r>
     </w:p>
     <w:p>
@@ -153,49 +122,17 @@
         </w:rPr>
         <w:t xml:space="preserve">ZOHAR BUZAGLO, ID 322282096, email: </w:t>
       </w:r>
-      <w:r>
-        <w:rPr>
-          <w:sz w:val="24"/>
-          <w:szCs w:val="24"/>
-        </w:rPr>
-        <w:fldChar w:fldCharType="begin"/>
-      </w:r>
-      <w:r>
-        <w:rPr>
-          <w:sz w:val="24"/>
-          <w:szCs w:val="24"/>
-        </w:rPr>
-        <w:instrText>HYPERLINK "mailto:zoharb0202@gmail.com"</w:instrText>
-      </w:r>
-      <w:r>
-        <w:rPr>
-          <w:sz w:val="24"/>
-          <w:szCs w:val="24"/>
-        </w:rPr>
-      </w:r>
-      <w:r>
-        <w:rPr>
-          <w:sz w:val="24"/>
-          <w:szCs w:val="24"/>
-        </w:rPr>
-        <w:fldChar w:fldCharType="separate"/>
-      </w:r>
-      <w:r>
-        <w:rPr>
-          <w:rStyle w:val="Hyperlink"/>
-          <w:rFonts w:asciiTheme="minorHAnsi" w:hAnsiTheme="minorHAnsi"/>
-          <w:sz w:val="24"/>
-          <w:szCs w:val="24"/>
-        </w:rPr>
-        <w:t>zoharb0202@gmail.com</w:t>
-      </w:r>
-      <w:r>
-        <w:rPr>
-          <w:sz w:val="24"/>
-          <w:szCs w:val="24"/>
-        </w:rPr>
-        <w:fldChar w:fldCharType="end"/>
-      </w:r>
+      <w:hyperlink r:id="rId5" w:history="1">
+        <w:r>
+          <w:rPr>
+            <w:rStyle w:val="Hyperlink"/>
+            <w:rFonts w:asciiTheme="minorHAnsi" w:hAnsiTheme="minorHAnsi"/>
+            <w:sz w:val="24"/>
+            <w:szCs w:val="24"/>
+          </w:rPr>
+          <w:t>zoharb0202@gmail.com</w:t>
+        </w:r>
+      </w:hyperlink>
       <w:r>
         <w:rPr>
           <w:rFonts w:asciiTheme="minorHAnsi" w:hAnsiTheme="minorHAnsi"/>
@@ -227,7 +164,7 @@
         </w:rPr>
         <w:t xml:space="preserve">KOBI SIMA, ID 209063742, email: </w:t>
       </w:r>
-      <w:hyperlink r:id="rId5" w:history="1">
+      <w:hyperlink r:id="rId6" w:history="1">
         <w:r>
           <w:rPr>
             <w:rStyle w:val="Hyperlink"/>
@@ -264,39 +201,7 @@
           <w:sz w:val="24"/>
           <w:szCs w:val="24"/>
         </w:rPr>
-        <w:t xml:space="preserve">Continuing from Exercise 1 (console, LMSR only). This exercise adds a JavaFX UI, multi-user accounts, and a second trading method </w:t>
-      </w:r>
-      <w:r>
-        <w:rPr>
-          <w:rFonts w:asciiTheme="minorBidi" w:hAnsiTheme="minorBidi" w:cstheme="minorBidi"/>
-          <w:sz w:val="24"/>
-          <w:szCs w:val="24"/>
-        </w:rPr>
-        <w:t>(</w:t>
-      </w:r>
-      <w:r>
-        <w:rPr>
-          <w:rFonts w:asciiTheme="minorBidi" w:hAnsiTheme="minorBidi" w:cstheme="minorBidi"/>
-          <w:sz w:val="24"/>
-          <w:szCs w:val="24"/>
-        </w:rPr>
-        <w:t>the Order Book</w:t>
-      </w:r>
-      <w:r>
-        <w:rPr>
-          <w:rFonts w:asciiTheme="minorBidi" w:hAnsiTheme="minorBidi" w:cstheme="minorBidi"/>
-          <w:sz w:val="24"/>
-          <w:szCs w:val="24"/>
-        </w:rPr>
-        <w:t>)</w:t>
-      </w:r>
-      <w:r>
-        <w:rPr>
-          <w:rFonts w:asciiTheme="minorBidi" w:hAnsiTheme="minorBidi" w:cstheme="minorBidi"/>
-          <w:sz w:val="24"/>
-          <w:szCs w:val="24"/>
-        </w:rPr>
-        <w:t>.</w:t>
+        <w:t>Continuing from Exercise 1 (console, LMSR only). This exercise adds a JavaFX UI, multi-user accounts, and a second trading method (the Order Book).</w:t>
       </w:r>
     </w:p>
     <w:p>
@@ -311,8 +216,14 @@
       <w:pPr>
         <w:pStyle w:val="Heading1"/>
         <w:spacing w:before="300" w:after="150"/>
-      </w:pPr>
-      <w:r>
+        <w:rPr>
+          <w:rFonts w:asciiTheme="minorBidi" w:hAnsiTheme="minorBidi" w:cstheme="minorBidi"/>
+        </w:rPr>
+      </w:pPr>
+      <w:r>
+        <w:rPr>
+          <w:rFonts w:asciiTheme="minorBidi" w:hAnsiTheme="minorBidi" w:cstheme="minorBidi"/>
+        </w:rPr>
         <w:t>Bonuses implemented</w:t>
       </w:r>
     </w:p>
@@ -331,23 +242,7 @@
           <w:sz w:val="24"/>
           <w:szCs w:val="24"/>
         </w:rPr>
-        <w:t xml:space="preserve">Skins and animations start disabled/default </w:t>
-      </w:r>
-      <w:r>
-        <w:rPr>
-          <w:rFonts w:asciiTheme="minorBidi" w:hAnsiTheme="minorBidi" w:cstheme="minorBidi"/>
-          <w:sz w:val="24"/>
-          <w:szCs w:val="24"/>
-        </w:rPr>
-        <w:t>-</w:t>
-      </w:r>
-      <w:r>
-        <w:rPr>
-          <w:rFonts w:asciiTheme="minorBidi" w:hAnsiTheme="minorBidi" w:cstheme="minorBidi"/>
-          <w:sz w:val="24"/>
-          <w:szCs w:val="24"/>
-        </w:rPr>
-        <w:t xml:space="preserve"> turn them on from the top bar to grade them.</w:t>
+        <w:t>Skins and animations start disabled/default - turn them on from the top bar to grade them.</w:t>
       </w:r>
     </w:p>
     <w:p>
@@ -427,23 +322,7 @@
           <w:sz w:val="24"/>
           <w:szCs w:val="24"/>
         </w:rPr>
-        <w:t xml:space="preserve"> an “Animations” checkbox in the top bar, unchecked by default. When enabled, the events table and users table fade in after a file loads, and the event/user detail panel fades in when you select a row. Every animation is under 2 seconds (300</w:t>
-      </w:r>
-      <w:r>
-        <w:rPr>
-          <w:rFonts w:asciiTheme="minorBidi" w:hAnsiTheme="minorBidi" w:cstheme="minorBidi"/>
-          <w:sz w:val="24"/>
-          <w:szCs w:val="24"/>
-        </w:rPr>
-        <w:t>-</w:t>
-      </w:r>
-      <w:r>
-        <w:rPr>
-          <w:rFonts w:asciiTheme="minorBidi" w:hAnsiTheme="minorBidi" w:cstheme="minorBidi"/>
-          <w:sz w:val="24"/>
-          <w:szCs w:val="24"/>
-        </w:rPr>
-        <w:t>500ms).</w:t>
+        <w:t xml:space="preserve"> an “Animations” checkbox in the top bar, unchecked by default. When enabled, the events table and users table fade in after a file loads, and the event/user detail panel fades in when you select a row. Every animation is under 2 seconds (300-500ms).</w:t>
       </w:r>
     </w:p>
     <w:p>
@@ -515,8 +394,14 @@
       <w:pPr>
         <w:pStyle w:val="Heading1"/>
         <w:spacing w:before="300" w:after="150"/>
-      </w:pPr>
-      <w:r>
+        <w:rPr>
+          <w:rFonts w:asciiTheme="minorBidi" w:hAnsiTheme="minorBidi" w:cstheme="minorBidi"/>
+        </w:rPr>
+      </w:pPr>
+      <w:r>
+        <w:rPr>
+          <w:rFonts w:asciiTheme="minorBidi" w:hAnsiTheme="minorBidi" w:cstheme="minorBidi"/>
+        </w:rPr>
         <w:t>Repository</w:t>
       </w:r>
     </w:p>
@@ -535,7 +420,7 @@
           <w:sz w:val="24"/>
           <w:szCs w:val="24"/>
         </w:rPr>
-        <w:t>All source code for this exercise is in the ex2 branch of:</w:t>
+        <w:t>All source code for this exercise is in:</w:t>
       </w:r>
     </w:p>
     <w:p>
@@ -547,54 +432,17 @@
           <w:szCs w:val="24"/>
         </w:rPr>
       </w:pPr>
-      <w:r>
-        <w:rPr>
-          <w:rFonts w:asciiTheme="minorBidi" w:hAnsiTheme="minorBidi" w:cstheme="minorBidi"/>
-          <w:sz w:val="24"/>
-          <w:szCs w:val="24"/>
-        </w:rPr>
-        <w:fldChar w:fldCharType="begin"/>
-      </w:r>
-      <w:r>
-        <w:rPr>
-          <w:rFonts w:asciiTheme="minorBidi" w:hAnsiTheme="minorBidi" w:cstheme="minorBidi"/>
-          <w:sz w:val="24"/>
-          <w:szCs w:val="24"/>
-        </w:rPr>
-        <w:instrText>HYPERLINK "https://github.com/KobiSima-1/GuessMarket"</w:instrText>
-      </w:r>
-      <w:r>
-        <w:rPr>
-          <w:rFonts w:asciiTheme="minorBidi" w:hAnsiTheme="minorBidi" w:cstheme="minorBidi"/>
-          <w:sz w:val="24"/>
-          <w:szCs w:val="24"/>
-        </w:rPr>
-      </w:r>
-      <w:r>
-        <w:rPr>
-          <w:rFonts w:asciiTheme="minorBidi" w:hAnsiTheme="minorBidi" w:cstheme="minorBidi"/>
-          <w:sz w:val="24"/>
-          <w:szCs w:val="24"/>
-        </w:rPr>
-        <w:fldChar w:fldCharType="separate"/>
-      </w:r>
-      <w:r>
-        <w:rPr>
-          <w:rStyle w:val="Hyperlink"/>
-          <w:rFonts w:asciiTheme="minorBidi" w:hAnsiTheme="minorBidi" w:cstheme="minorBidi"/>
-          <w:sz w:val="24"/>
-          <w:szCs w:val="24"/>
-        </w:rPr>
-        <w:t>https://github.com/KobiSima-1/GuessMarket</w:t>
-      </w:r>
-      <w:r>
-        <w:rPr>
-          <w:rFonts w:asciiTheme="minorBidi" w:hAnsiTheme="minorBidi" w:cstheme="minorBidi"/>
-          <w:sz w:val="24"/>
-          <w:szCs w:val="24"/>
-        </w:rPr>
-        <w:fldChar w:fldCharType="end"/>
-      </w:r>
+      <w:hyperlink r:id="rId7" w:history="1">
+        <w:r>
+          <w:rPr>
+            <w:rStyle w:val="Hyperlink"/>
+            <w:rFonts w:asciiTheme="minorBidi" w:hAnsiTheme="minorBidi" w:cstheme="minorBidi"/>
+            <w:sz w:val="24"/>
+            <w:szCs w:val="24"/>
+          </w:rPr>
+          <w:t>https://github.com/KobiSima-1/GuessMarket-Ex2</w:t>
+        </w:r>
+      </w:hyperlink>
     </w:p>
     <w:p>
       <w:pPr>
@@ -608,8 +456,14 @@
       <w:pPr>
         <w:pStyle w:val="Heading1"/>
         <w:spacing w:before="300" w:after="150"/>
-      </w:pPr>
-      <w:r>
+        <w:rPr>
+          <w:rFonts w:asciiTheme="minorBidi" w:hAnsiTheme="minorBidi" w:cstheme="minorBidi"/>
+        </w:rPr>
+      </w:pPr>
+      <w:r>
+        <w:rPr>
+          <w:rFonts w:asciiTheme="minorBidi" w:hAnsiTheme="minorBidi" w:cstheme="minorBidi"/>
+        </w:rPr>
         <w:t>How the system works</w:t>
       </w:r>
     </w:p>
@@ -727,71 +581,7 @@
           <w:szCs w:val="24"/>
         </w:rPr>
         <w:lastRenderedPageBreak/>
-        <w:t xml:space="preserve">Order Book </w:t>
-      </w:r>
-      <w:r>
-        <w:rPr>
-          <w:rFonts w:asciiTheme="minorBidi" w:hAnsiTheme="minorBidi" w:cstheme="minorBidi"/>
-          <w:sz w:val="24"/>
-          <w:szCs w:val="24"/>
-        </w:rPr>
-        <w:t>-</w:t>
-      </w:r>
-      <w:r>
-        <w:rPr>
-          <w:rFonts w:asciiTheme="minorBidi" w:hAnsiTheme="minorBidi" w:cstheme="minorBidi"/>
-          <w:sz w:val="24"/>
-          <w:szCs w:val="24"/>
-        </w:rPr>
-        <w:t xml:space="preserve"> buyers and sellers post orders </w:t>
-      </w:r>
-      <w:r>
-        <w:rPr>
-          <w:rFonts w:asciiTheme="minorBidi" w:hAnsiTheme="minorBidi" w:cstheme="minorBidi"/>
-          <w:sz w:val="24"/>
-          <w:szCs w:val="24"/>
-        </w:rPr>
-        <w:t>by</w:t>
-      </w:r>
-      <w:r>
-        <w:rPr>
-          <w:rFonts w:asciiTheme="minorBidi" w:hAnsiTheme="minorBidi" w:cstheme="minorBidi"/>
-          <w:sz w:val="24"/>
-          <w:szCs w:val="24"/>
-        </w:rPr>
-        <w:t xml:space="preserve"> option</w:t>
-      </w:r>
-      <w:r>
-        <w:rPr>
-          <w:rFonts w:asciiTheme="minorBidi" w:hAnsiTheme="minorBidi" w:cstheme="minorBidi"/>
-          <w:sz w:val="24"/>
-          <w:szCs w:val="24"/>
-        </w:rPr>
-        <w:t>.</w:t>
-      </w:r>
-      <w:r>
-        <w:rPr>
-          <w:rFonts w:asciiTheme="minorBidi" w:hAnsiTheme="minorBidi" w:cstheme="minorBidi"/>
-          <w:sz w:val="24"/>
-          <w:szCs w:val="24"/>
-        </w:rPr>
-        <w:t xml:space="preserve"> </w:t>
-      </w:r>
-      <w:r>
-        <w:rPr>
-          <w:rFonts w:asciiTheme="minorBidi" w:hAnsiTheme="minorBidi" w:cstheme="minorBidi"/>
-          <w:sz w:val="24"/>
-          <w:szCs w:val="24"/>
-        </w:rPr>
-        <w:t>T</w:t>
-      </w:r>
-      <w:r>
-        <w:rPr>
-          <w:rFonts w:asciiTheme="minorBidi" w:hAnsiTheme="minorBidi" w:cstheme="minorBidi"/>
-          <w:sz w:val="24"/>
-          <w:szCs w:val="24"/>
-        </w:rPr>
-        <w:t>he engine matches them and, when allowed, mints new share pairs when two opposite buy orders together reach the event's base value.</w:t>
+        <w:t>Order Book - buyers and sellers post orders by option. The engine matches them and, when allowed, mints new share pairs when two opposite buy orders together reach the event's base value.</w:t>
       </w:r>
     </w:p>
     <w:p>
@@ -809,31 +599,21 @@
           <w:sz w:val="24"/>
           <w:szCs w:val="24"/>
         </w:rPr>
-        <w:t xml:space="preserve">Users are loaded from the XML file with a starting cash balance. Each event has exactly one market maker (MM) </w:t>
-      </w:r>
-      <w:r>
-        <w:rPr>
-          <w:rFonts w:asciiTheme="minorBidi" w:hAnsiTheme="minorBidi" w:cstheme="minorBidi"/>
-          <w:sz w:val="24"/>
-          <w:szCs w:val="24"/>
-        </w:rPr>
-        <w:t>-</w:t>
-      </w:r>
-      <w:r>
-        <w:rPr>
-          <w:rFonts w:asciiTheme="minorBidi" w:hAnsiTheme="minorBidi" w:cstheme="minorBidi"/>
-          <w:sz w:val="24"/>
-          <w:szCs w:val="24"/>
-        </w:rPr>
-        <w:t xml:space="preserve"> the user who opens it (paying the initial investment), closes it (declaring the winning option), and collects its commissions. A user who goes into a negative balance is blocked permanently and cannot act again.</w:t>
+        <w:t>Users are loaded from the XML file with a starting cash balance. Each event has exactly one market maker (MM) - the user who opens it (paying the initial investment), closes it (declaring the winning option), and collects its commissions. A user who goes into a negative balance is blocked permanently and cannot act again.</w:t>
       </w:r>
     </w:p>
     <w:p>
       <w:pPr>
         <w:pStyle w:val="Heading1"/>
         <w:spacing w:before="300" w:after="150"/>
-      </w:pPr>
-      <w:r>
+        <w:rPr>
+          <w:rFonts w:asciiTheme="minorBidi" w:hAnsiTheme="minorBidi" w:cstheme="minorBidi"/>
+        </w:rPr>
+      </w:pPr>
+      <w:r>
+        <w:rPr>
+          <w:rFonts w:asciiTheme="minorBidi" w:hAnsiTheme="minorBidi" w:cstheme="minorBidi"/>
+        </w:rPr>
         <w:t>Modules</w:t>
       </w:r>
     </w:p>
@@ -859,12 +639,6 @@
         <w:gridCol w:w="7340"/>
       </w:tblGrid>
       <w:tr>
-        <w:tblPrEx>
-          <w:tblCellMar>
-            <w:top w:w="0" w:type="dxa"/>
-            <w:bottom w:w="0" w:type="dxa"/>
-          </w:tblCellMar>
-        </w:tblPrEx>
         <w:trPr>
           <w:trHeight w:val="1"/>
         </w:trPr>
@@ -900,12 +674,6 @@
         </w:tc>
       </w:tr>
       <w:tr>
-        <w:tblPrEx>
-          <w:tblCellMar>
-            <w:top w:w="0" w:type="dxa"/>
-            <w:bottom w:w="0" w:type="dxa"/>
-          </w:tblCellMar>
-        </w:tblPrEx>
         <w:trPr>
           <w:trHeight w:val="3"/>
         </w:trPr>
@@ -949,34 +717,12 @@
                 <w:sz w:val="22"/>
                 <w:szCs w:val="22"/>
               </w:rPr>
-              <w:t xml:space="preserve">The system engine </w:t>
-            </w:r>
-            <w:r>
-              <w:rPr>
-                <w:rFonts w:asciiTheme="minorBidi" w:hAnsiTheme="minorBidi" w:cstheme="minorBidi"/>
-                <w:sz w:val="22"/>
-                <w:szCs w:val="22"/>
-              </w:rPr>
-              <w:t>-</w:t>
-            </w:r>
-            <w:r>
-              <w:rPr>
-                <w:rFonts w:asciiTheme="minorBidi" w:hAnsiTheme="minorBidi" w:cstheme="minorBidi"/>
-                <w:sz w:val="22"/>
-                <w:szCs w:val="22"/>
-              </w:rPr>
-              <w:t xml:space="preserve"> events, users, accounts, the two trading methods, XML loading and validation, and the DTO-only API the UI talks to. Holds no JavaFX code and prints nothing.</w:t>
+              <w:t>The system engine - events, users, accounts, the two trading methods, XML loading and validation, and the DTO-only API the UI talks to. Holds no JavaFX code and prints nothing.</w:t>
             </w:r>
           </w:p>
         </w:tc>
       </w:tr>
       <w:tr>
-        <w:tblPrEx>
-          <w:tblCellMar>
-            <w:top w:w="0" w:type="dxa"/>
-            <w:bottom w:w="0" w:type="dxa"/>
-          </w:tblCellMar>
-        </w:tblPrEx>
         <w:trPr>
           <w:trHeight w:val="2"/>
         </w:trPr>
@@ -992,6 +738,7 @@
                 <w:szCs w:val="22"/>
               </w:rPr>
             </w:pPr>
+            <w:proofErr w:type="spellStart"/>
             <w:r>
               <w:rPr>
                 <w:rFonts w:asciiTheme="minorBidi" w:eastAsia="Consolas" w:hAnsiTheme="minorBidi" w:cstheme="minorBidi"/>
@@ -1000,6 +747,7 @@
               </w:rPr>
               <w:t>ui</w:t>
             </w:r>
+            <w:proofErr w:type="spellEnd"/>
           </w:p>
         </w:tc>
         <w:tc>
@@ -1020,34 +768,48 @@
                 <w:sz w:val="22"/>
                 <w:szCs w:val="22"/>
               </w:rPr>
-              <w:t xml:space="preserve">The JavaFX interface </w:t>
-            </w:r>
-            <w:r>
-              <w:rPr>
-                <w:rFonts w:asciiTheme="minorBidi" w:hAnsiTheme="minorBidi" w:cstheme="minorBidi"/>
-                <w:sz w:val="22"/>
-                <w:szCs w:val="22"/>
-              </w:rPr>
-              <w:t>-</w:t>
-            </w:r>
-            <w:r>
-              <w:rPr>
-                <w:rFonts w:asciiTheme="minorBidi" w:hAnsiTheme="minorBidi" w:cstheme="minorBidi"/>
-                <w:sz w:val="22"/>
-                <w:szCs w:val="22"/>
-              </w:rPr>
-              <w:t xml:space="preserve"> MainApp, the main controller, and the FXML layout. Talks to the engine only through GuessMarketEngine and its DTOs.</w:t>
+              <w:t xml:space="preserve">The JavaFX interface - </w:t>
+            </w:r>
+            <w:proofErr w:type="spellStart"/>
+            <w:r>
+              <w:rPr>
+                <w:rFonts w:asciiTheme="minorBidi" w:hAnsiTheme="minorBidi" w:cstheme="minorBidi"/>
+                <w:sz w:val="22"/>
+                <w:szCs w:val="22"/>
+              </w:rPr>
+              <w:t>MainApp</w:t>
+            </w:r>
+            <w:proofErr w:type="spellEnd"/>
+            <w:r>
+              <w:rPr>
+                <w:rFonts w:asciiTheme="minorBidi" w:hAnsiTheme="minorBidi" w:cstheme="minorBidi"/>
+                <w:sz w:val="22"/>
+                <w:szCs w:val="22"/>
+              </w:rPr>
+              <w:t xml:space="preserve">, the main controller, and the FXML layout. Talks to the engine only through </w:t>
+            </w:r>
+            <w:proofErr w:type="spellStart"/>
+            <w:r>
+              <w:rPr>
+                <w:rFonts w:asciiTheme="minorBidi" w:hAnsiTheme="minorBidi" w:cstheme="minorBidi"/>
+                <w:sz w:val="22"/>
+                <w:szCs w:val="22"/>
+              </w:rPr>
+              <w:t>GuessMarketEngine</w:t>
+            </w:r>
+            <w:proofErr w:type="spellEnd"/>
+            <w:r>
+              <w:rPr>
+                <w:rFonts w:asciiTheme="minorBidi" w:hAnsiTheme="minorBidi" w:cstheme="minorBidi"/>
+                <w:sz w:val="22"/>
+                <w:szCs w:val="22"/>
+              </w:rPr>
+              <w:t xml:space="preserve"> and its DTOs.</w:t>
             </w:r>
           </w:p>
         </w:tc>
       </w:tr>
       <w:tr>
-        <w:tblPrEx>
-          <w:tblCellMar>
-            <w:top w:w="0" w:type="dxa"/>
-            <w:bottom w:w="0" w:type="dxa"/>
-          </w:tblCellMar>
-        </w:tblPrEx>
         <w:trPr>
           <w:trHeight w:val="422"/>
         </w:trPr>
@@ -1100,23 +862,31 @@
                 <w:sz w:val="22"/>
                 <w:szCs w:val="22"/>
               </w:rPr>
-              <w:t xml:space="preserve">Left in the repository for history only (Exercise 1's console app). It is excluded from the build </w:t>
-            </w:r>
-            <w:r>
-              <w:rPr>
-                <w:rFonts w:asciiTheme="minorBidi" w:hAnsiTheme="minorBidi" w:cstheme="minorBidi"/>
-                <w:sz w:val="22"/>
-                <w:szCs w:val="22"/>
-              </w:rPr>
-              <w:t>-</w:t>
-            </w:r>
-            <w:r>
-              <w:rPr>
-                <w:rFonts w:asciiTheme="minorBidi" w:hAnsiTheme="minorBidi" w:cstheme="minorBidi"/>
-                <w:sz w:val="22"/>
-                <w:szCs w:val="22"/>
-              </w:rPr>
-              <w:t xml:space="preserve"> the code no longer compiles against the new engine, since the engine's API changed for Exercise 2.</w:t>
+              <w:t>Kept</w:t>
+            </w:r>
+            <w:r>
+              <w:rPr>
+                <w:rFonts w:asciiTheme="minorBidi" w:hAnsiTheme="minorBidi" w:cstheme="minorBidi"/>
+                <w:sz w:val="22"/>
+                <w:szCs w:val="22"/>
+              </w:rPr>
+              <w:t xml:space="preserve"> in the repository for </w:t>
+            </w:r>
+            <w:r>
+              <w:rPr>
+                <w:rFonts w:asciiTheme="minorBidi" w:hAnsiTheme="minorBidi" w:cstheme="minorBidi"/>
+                <w:sz w:val="22"/>
+                <w:szCs w:val="22"/>
+              </w:rPr>
+              <w:t>reference</w:t>
+            </w:r>
+            <w:r>
+              <w:rPr>
+                <w:rFonts w:asciiTheme="minorBidi" w:hAnsiTheme="minorBidi" w:cstheme="minorBidi"/>
+                <w:sz w:val="22"/>
+                <w:szCs w:val="22"/>
+              </w:rPr>
+              <w:t xml:space="preserve"> only (Exercise 1's console app). It is excluded from the build - the code no longer compiles against the new engine, since the engine's API changed for Exercise 2.</w:t>
             </w:r>
           </w:p>
         </w:tc>
@@ -1134,19 +904,33 @@
       <w:pPr>
         <w:pStyle w:val="Heading1"/>
         <w:spacing w:before="300" w:after="150"/>
-      </w:pPr>
-      <w:r>
-        <w:t>New classes (for the grader)</w:t>
+        <w:rPr>
+          <w:rFonts w:asciiTheme="minorBidi" w:hAnsiTheme="minorBidi" w:cstheme="minorBidi"/>
+        </w:rPr>
+      </w:pPr>
+      <w:r>
+        <w:rPr>
+          <w:rFonts w:asciiTheme="minorBidi" w:hAnsiTheme="minorBidi" w:cstheme="minorBidi"/>
+        </w:rPr>
+        <w:t>New classes</w:t>
       </w:r>
     </w:p>
     <w:p>
       <w:pPr>
         <w:pStyle w:val="Heading2"/>
         <w:spacing w:before="240" w:after="120"/>
-      </w:pPr>
-      <w:r>
+        <w:rPr>
+          <w:rFonts w:asciiTheme="minorBidi" w:hAnsiTheme="minorBidi" w:cstheme="minorBidi"/>
+        </w:rPr>
+      </w:pPr>
+      <w:proofErr w:type="spellStart"/>
+      <w:r>
+        <w:rPr>
+          <w:rFonts w:asciiTheme="minorBidi" w:hAnsiTheme="minorBidi" w:cstheme="minorBidi"/>
+        </w:rPr>
         <w:t>engine.model</w:t>
       </w:r>
+      <w:proofErr w:type="spellEnd"/>
     </w:p>
     <w:tbl>
       <w:tblPr>
@@ -1170,12 +954,6 @@
         <w:gridCol w:w="7444"/>
       </w:tblGrid>
       <w:tr>
-        <w:tblPrEx>
-          <w:tblCellMar>
-            <w:top w:w="0" w:type="dxa"/>
-            <w:bottom w:w="0" w:type="dxa"/>
-          </w:tblCellMar>
-        </w:tblPrEx>
         <w:trPr>
           <w:trHeight w:val="262"/>
         </w:trPr>
@@ -1216,12 +994,6 @@
         </w:tc>
       </w:tr>
       <w:tr>
-        <w:tblPrEx>
-          <w:tblCellMar>
-            <w:top w:w="0" w:type="dxa"/>
-            <w:bottom w:w="0" w:type="dxa"/>
-          </w:tblCellMar>
-        </w:tblPrEx>
         <w:trPr>
           <w:trHeight w:val="262"/>
         </w:trPr>
@@ -1265,34 +1037,12 @@
                 <w:sz w:val="22"/>
                 <w:szCs w:val="22"/>
               </w:rPr>
-              <w:t>A user's account, market-maker roles, and per</w:t>
-            </w:r>
-            <w:r>
-              <w:rPr>
-                <w:rFonts w:asciiTheme="minorBidi" w:hAnsiTheme="minorBidi" w:cstheme="minorBidi"/>
-                <w:sz w:val="22"/>
-                <w:szCs w:val="22"/>
-              </w:rPr>
-              <w:t xml:space="preserve"> </w:t>
-            </w:r>
-            <w:r>
-              <w:rPr>
-                <w:rFonts w:asciiTheme="minorBidi" w:hAnsiTheme="minorBidi" w:cstheme="minorBidi"/>
-                <w:sz w:val="22"/>
-                <w:szCs w:val="22"/>
-              </w:rPr>
-              <w:t>event participations.</w:t>
+              <w:t>A user's account, market-maker roles, and per event participations.</w:t>
             </w:r>
           </w:p>
         </w:tc>
       </w:tr>
       <w:tr>
-        <w:tblPrEx>
-          <w:tblCellMar>
-            <w:top w:w="0" w:type="dxa"/>
-            <w:bottom w:w="0" w:type="dxa"/>
-          </w:tblCellMar>
-        </w:tblPrEx>
         <w:trPr>
           <w:trHeight w:val="804"/>
         </w:trPr>
@@ -1336,34 +1086,12 @@
                 <w:sz w:val="22"/>
                 <w:szCs w:val="22"/>
               </w:rPr>
-              <w:t xml:space="preserve">Everything one user holds and did inside one event </w:t>
-            </w:r>
-            <w:r>
-              <w:rPr>
-                <w:rFonts w:asciiTheme="minorBidi" w:hAnsiTheme="minorBidi" w:cstheme="minorBidi"/>
-                <w:sz w:val="22"/>
-                <w:szCs w:val="22"/>
-              </w:rPr>
-              <w:t>-</w:t>
-            </w:r>
-            <w:r>
-              <w:rPr>
-                <w:rFonts w:asciiTheme="minorBidi" w:hAnsiTheme="minorBidi" w:cstheme="minorBidi"/>
-                <w:sz w:val="22"/>
-                <w:szCs w:val="22"/>
-              </w:rPr>
-              <w:t xml:space="preserve"> shares per option, net amount paid, commission paid, trade history, and (once closed) payout/profit-loss.</w:t>
+              <w:t>Everything one user holds and did inside one event - shares per option, net amount paid, commission paid, trade history, and (once closed) payout/profit-loss.</w:t>
             </w:r>
           </w:p>
         </w:tc>
       </w:tr>
       <w:tr>
-        <w:tblPrEx>
-          <w:tblCellMar>
-            <w:top w:w="0" w:type="dxa"/>
-            <w:bottom w:w="0" w:type="dxa"/>
-          </w:tblCellMar>
-        </w:tblPrEx>
         <w:trPr>
           <w:trHeight w:val="524"/>
         </w:trPr>
@@ -1413,12 +1141,6 @@
         </w:tc>
       </w:tr>
       <w:tr>
-        <w:tblPrEx>
-          <w:tblCellMar>
-            <w:top w:w="0" w:type="dxa"/>
-            <w:bottom w:w="0" w:type="dxa"/>
-          </w:tblCellMar>
-        </w:tblPrEx>
         <w:trPr>
           <w:trHeight w:val="524"/>
         </w:trPr>
@@ -1434,6 +1156,7 @@
                 <w:szCs w:val="22"/>
               </w:rPr>
             </w:pPr>
+            <w:proofErr w:type="spellStart"/>
             <w:r>
               <w:rPr>
                 <w:rFonts w:asciiTheme="minorBidi" w:eastAsia="Consolas" w:hAnsiTheme="minorBidi" w:cstheme="minorBidi"/>
@@ -1442,6 +1165,7 @@
               </w:rPr>
               <w:t>OrderBook</w:t>
             </w:r>
+            <w:proofErr w:type="spellEnd"/>
           </w:p>
         </w:tc>
         <w:tc>
@@ -1462,42 +1186,12 @@
                 <w:sz w:val="22"/>
                 <w:szCs w:val="22"/>
               </w:rPr>
-              <w:t>The bid/ask book of one option</w:t>
-            </w:r>
-            <w:r>
-              <w:rPr>
-                <w:rFonts w:asciiTheme="minorBidi" w:hAnsiTheme="minorBidi" w:cstheme="minorBidi"/>
-                <w:sz w:val="22"/>
-                <w:szCs w:val="22"/>
-              </w:rPr>
-              <w:t xml:space="preserve"> kept sorted by price</w:t>
-            </w:r>
-            <w:r>
-              <w:rPr>
-                <w:rFonts w:asciiTheme="minorBidi" w:hAnsiTheme="minorBidi" w:cstheme="minorBidi"/>
-                <w:sz w:val="22"/>
-                <w:szCs w:val="22"/>
-              </w:rPr>
-              <w:t xml:space="preserve">. </w:t>
-            </w:r>
-            <w:r>
-              <w:rPr>
-                <w:rFonts w:asciiTheme="minorBidi" w:hAnsiTheme="minorBidi" w:cstheme="minorBidi"/>
-                <w:sz w:val="22"/>
-                <w:szCs w:val="22"/>
-              </w:rPr>
-              <w:t>exposes best bid/ask, mid price and spread.</w:t>
+              <w:t>The bid/ask book of one option kept sorted by price. exposes best bid/ask, mid price and spread.</w:t>
             </w:r>
           </w:p>
         </w:tc>
       </w:tr>
       <w:tr>
-        <w:tblPrEx>
-          <w:tblCellMar>
-            <w:top w:w="0" w:type="dxa"/>
-            <w:bottom w:w="0" w:type="dxa"/>
-          </w:tblCellMar>
-        </w:tblPrEx>
         <w:trPr>
           <w:trHeight w:val="542"/>
         </w:trPr>
@@ -1513,6 +1207,7 @@
                 <w:szCs w:val="22"/>
               </w:rPr>
             </w:pPr>
+            <w:proofErr w:type="spellStart"/>
             <w:r>
               <w:rPr>
                 <w:rFonts w:asciiTheme="minorBidi" w:eastAsia="Consolas" w:hAnsiTheme="minorBidi" w:cstheme="minorBidi"/>
@@ -1521,6 +1216,7 @@
               </w:rPr>
               <w:t>TradeResult</w:t>
             </w:r>
+            <w:proofErr w:type="spellEnd"/>
           </w:p>
         </w:tc>
         <w:tc>
@@ -1541,34 +1237,12 @@
                 <w:sz w:val="22"/>
                 <w:szCs w:val="22"/>
               </w:rPr>
-              <w:t xml:space="preserve">What happened as a result of one action </w:t>
-            </w:r>
-            <w:r>
-              <w:rPr>
-                <w:rFonts w:asciiTheme="minorBidi" w:hAnsiTheme="minorBidi" w:cstheme="minorBidi"/>
-                <w:sz w:val="22"/>
-                <w:szCs w:val="22"/>
-              </w:rPr>
-              <w:t>-</w:t>
-            </w:r>
-            <w:r>
-              <w:rPr>
-                <w:rFonts w:asciiTheme="minorBidi" w:hAnsiTheme="minorBidi" w:cstheme="minorBidi"/>
-                <w:sz w:val="22"/>
-                <w:szCs w:val="22"/>
-              </w:rPr>
-              <w:t xml:space="preserve"> the trades it produced, how much filled vs. is resting, whether a mint occurred, and which users got blocked.</w:t>
+              <w:t>What happened as a result of one action - the trades it produced, how much filled vs. is resting, whether a mint occurred, and which users got blocked.</w:t>
             </w:r>
           </w:p>
         </w:tc>
       </w:tr>
       <w:tr>
-        <w:tblPrEx>
-          <w:tblCellMar>
-            <w:top w:w="0" w:type="dxa"/>
-            <w:bottom w:w="0" w:type="dxa"/>
-          </w:tblCellMar>
-        </w:tblPrEx>
         <w:trPr>
           <w:trHeight w:val="524"/>
         </w:trPr>
@@ -1583,6 +1257,7 @@
                 <w:szCs w:val="22"/>
               </w:rPr>
             </w:pPr>
+            <w:proofErr w:type="spellStart"/>
             <w:r>
               <w:rPr>
                 <w:rFonts w:asciiTheme="minorBidi" w:eastAsia="Consolas" w:hAnsiTheme="minorBidi" w:cstheme="minorBidi"/>
@@ -1591,6 +1266,7 @@
               </w:rPr>
               <w:t>UserLookup</w:t>
             </w:r>
+            <w:proofErr w:type="spellEnd"/>
           </w:p>
         </w:tc>
         <w:tc>
@@ -1621,10 +1297,18 @@
       <w:pPr>
         <w:pStyle w:val="Heading2"/>
         <w:spacing w:before="240" w:after="120"/>
-      </w:pPr>
-      <w:r>
+        <w:rPr>
+          <w:rFonts w:asciiTheme="minorBidi" w:hAnsiTheme="minorBidi" w:cstheme="minorBidi"/>
+        </w:rPr>
+      </w:pPr>
+      <w:proofErr w:type="spellStart"/>
+      <w:r>
+        <w:rPr>
+          <w:rFonts w:asciiTheme="minorBidi" w:hAnsiTheme="minorBidi" w:cstheme="minorBidi"/>
+        </w:rPr>
         <w:t>engine.method</w:t>
       </w:r>
+      <w:proofErr w:type="spellEnd"/>
     </w:p>
     <w:tbl>
       <w:tblPr>
@@ -1648,12 +1332,6 @@
         <w:gridCol w:w="7444"/>
       </w:tblGrid>
       <w:tr>
-        <w:tblPrEx>
-          <w:tblCellMar>
-            <w:top w:w="0" w:type="dxa"/>
-            <w:bottom w:w="0" w:type="dxa"/>
-          </w:tblCellMar>
-        </w:tblPrEx>
         <w:trPr>
           <w:trHeight w:val="358"/>
         </w:trPr>
@@ -1689,12 +1367,6 @@
         </w:tc>
       </w:tr>
       <w:tr>
-        <w:tblPrEx>
-          <w:tblCellMar>
-            <w:top w:w="0" w:type="dxa"/>
-            <w:bottom w:w="0" w:type="dxa"/>
-          </w:tblCellMar>
-        </w:tblPrEx>
         <w:trPr>
           <w:trHeight w:val="717"/>
         </w:trPr>
@@ -1710,6 +1382,7 @@
                 <w:szCs w:val="22"/>
               </w:rPr>
             </w:pPr>
+            <w:proofErr w:type="spellStart"/>
             <w:r>
               <w:rPr>
                 <w:rFonts w:asciiTheme="minorBidi" w:eastAsia="Consolas" w:hAnsiTheme="minorBidi" w:cstheme="minorBidi"/>
@@ -1718,6 +1391,7 @@
               </w:rPr>
               <w:t>OrderBookMethod</w:t>
             </w:r>
+            <w:proofErr w:type="spellEnd"/>
           </w:p>
         </w:tc>
         <w:tc>
@@ -1738,7 +1412,25 @@
                 <w:sz w:val="22"/>
                 <w:szCs w:val="22"/>
               </w:rPr>
-              <w:t>The new trading method: one OrderBook per option, the base value d, whether minting is allowed, and the market maker's initial share allocation.</w:t>
+              <w:t xml:space="preserve">The new trading method: one </w:t>
+            </w:r>
+            <w:proofErr w:type="spellStart"/>
+            <w:r>
+              <w:rPr>
+                <w:rFonts w:asciiTheme="minorBidi" w:hAnsiTheme="minorBidi" w:cstheme="minorBidi"/>
+                <w:sz w:val="22"/>
+                <w:szCs w:val="22"/>
+              </w:rPr>
+              <w:t>OrderBook</w:t>
+            </w:r>
+            <w:proofErr w:type="spellEnd"/>
+            <w:r>
+              <w:rPr>
+                <w:rFonts w:asciiTheme="minorBidi" w:hAnsiTheme="minorBidi" w:cstheme="minorBidi"/>
+                <w:sz w:val="22"/>
+                <w:szCs w:val="22"/>
+              </w:rPr>
+              <w:t xml:space="preserve"> per option, the base value d, whether minting is allowed, and the market maker's initial share allocation.</w:t>
             </w:r>
           </w:p>
         </w:tc>
@@ -1748,54 +1440,252 @@
       <w:pPr>
         <w:pStyle w:val="Heading2"/>
         <w:spacing w:before="240" w:after="120"/>
-      </w:pPr>
-      <w:r>
+        <w:rPr>
+          <w:rFonts w:asciiTheme="minorBidi" w:hAnsiTheme="minorBidi" w:cstheme="minorBidi"/>
+        </w:rPr>
+      </w:pPr>
+      <w:proofErr w:type="spellStart"/>
+      <w:r>
+        <w:rPr>
+          <w:rFonts w:asciiTheme="minorBidi" w:hAnsiTheme="minorBidi" w:cstheme="minorBidi"/>
+        </w:rPr>
         <w:t>engine.dto</w:t>
       </w:r>
+      <w:proofErr w:type="spellEnd"/>
     </w:p>
     <w:p>
       <w:pPr>
         <w:spacing w:after="120"/>
         <w:rPr>
           <w:rFonts w:asciiTheme="minorBidi" w:hAnsiTheme="minorBidi" w:cstheme="minorBidi"/>
-          <w:sz w:val="22"/>
-          <w:szCs w:val="22"/>
-        </w:rPr>
-      </w:pPr>
-      <w:r>
-        <w:rPr>
-          <w:rFonts w:asciiTheme="minorBidi" w:hAnsiTheme="minorBidi" w:cstheme="minorBidi"/>
-          <w:sz w:val="22"/>
-          <w:szCs w:val="22"/>
+          <w:sz w:val="24"/>
+          <w:szCs w:val="24"/>
+        </w:rPr>
+      </w:pPr>
+      <w:r>
+        <w:rPr>
+          <w:rFonts w:asciiTheme="minorBidi" w:hAnsiTheme="minorBidi" w:cstheme="minorBidi"/>
+          <w:sz w:val="24"/>
+          <w:szCs w:val="24"/>
         </w:rPr>
         <w:lastRenderedPageBreak/>
-        <w:t xml:space="preserve">Eleven DTOs (EventDto, EventStateDto, OrderBookStateDto, OptionBookDto, OrderDto, ParticipantDto, ParticipationDto, TradeDto, TradeResultDto, UserDto, OptionStateDto) </w:t>
-      </w:r>
-      <w:r>
-        <w:rPr>
-          <w:rFonts w:asciiTheme="minorBidi" w:hAnsiTheme="minorBidi" w:cstheme="minorBidi"/>
-          <w:sz w:val="22"/>
-          <w:szCs w:val="22"/>
-        </w:rPr>
-        <w:t>-</w:t>
-      </w:r>
-      <w:r>
-        <w:rPr>
-          <w:rFonts w:asciiTheme="minorBidi" w:hAnsiTheme="minorBidi" w:cstheme="minorBidi"/>
-          <w:sz w:val="22"/>
-          <w:szCs w:val="22"/>
-        </w:rPr>
-        <w:t xml:space="preserve"> plain read-only carriers so the UI never touches the engine's internal model classes.</w:t>
+        <w:t>Eleven DTOs (</w:t>
+      </w:r>
+      <w:proofErr w:type="spellStart"/>
+      <w:r>
+        <w:rPr>
+          <w:rFonts w:asciiTheme="minorBidi" w:hAnsiTheme="minorBidi" w:cstheme="minorBidi"/>
+          <w:sz w:val="24"/>
+          <w:szCs w:val="24"/>
+        </w:rPr>
+        <w:t>EventDto</w:t>
+      </w:r>
+      <w:proofErr w:type="spellEnd"/>
+      <w:r>
+        <w:rPr>
+          <w:rFonts w:asciiTheme="minorBidi" w:hAnsiTheme="minorBidi" w:cstheme="minorBidi"/>
+          <w:sz w:val="24"/>
+          <w:szCs w:val="24"/>
+        </w:rPr>
+        <w:t xml:space="preserve">, </w:t>
+      </w:r>
+      <w:proofErr w:type="spellStart"/>
+      <w:r>
+        <w:rPr>
+          <w:rFonts w:asciiTheme="minorBidi" w:hAnsiTheme="minorBidi" w:cstheme="minorBidi"/>
+          <w:sz w:val="24"/>
+          <w:szCs w:val="24"/>
+        </w:rPr>
+        <w:t>EventStateDto</w:t>
+      </w:r>
+      <w:proofErr w:type="spellEnd"/>
+      <w:r>
+        <w:rPr>
+          <w:rFonts w:asciiTheme="minorBidi" w:hAnsiTheme="minorBidi" w:cstheme="minorBidi"/>
+          <w:sz w:val="24"/>
+          <w:szCs w:val="24"/>
+        </w:rPr>
+        <w:t xml:space="preserve">, </w:t>
+      </w:r>
+      <w:proofErr w:type="spellStart"/>
+      <w:r>
+        <w:rPr>
+          <w:rFonts w:asciiTheme="minorBidi" w:hAnsiTheme="minorBidi" w:cstheme="minorBidi"/>
+          <w:sz w:val="24"/>
+          <w:szCs w:val="24"/>
+        </w:rPr>
+        <w:t>OrderBookStateDto</w:t>
+      </w:r>
+      <w:proofErr w:type="spellEnd"/>
+      <w:r>
+        <w:rPr>
+          <w:rFonts w:asciiTheme="minorBidi" w:hAnsiTheme="minorBidi" w:cstheme="minorBidi"/>
+          <w:sz w:val="24"/>
+          <w:szCs w:val="24"/>
+        </w:rPr>
+        <w:t xml:space="preserve">, </w:t>
+      </w:r>
+      <w:proofErr w:type="spellStart"/>
+      <w:r>
+        <w:rPr>
+          <w:rFonts w:asciiTheme="minorBidi" w:hAnsiTheme="minorBidi" w:cstheme="minorBidi"/>
+          <w:sz w:val="24"/>
+          <w:szCs w:val="24"/>
+        </w:rPr>
+        <w:t>OptionBookDto</w:t>
+      </w:r>
+      <w:proofErr w:type="spellEnd"/>
+      <w:r>
+        <w:rPr>
+          <w:rFonts w:asciiTheme="minorBidi" w:hAnsiTheme="minorBidi" w:cstheme="minorBidi"/>
+          <w:sz w:val="24"/>
+          <w:szCs w:val="24"/>
+        </w:rPr>
+        <w:t xml:space="preserve">, </w:t>
+      </w:r>
+      <w:proofErr w:type="spellStart"/>
+      <w:r>
+        <w:rPr>
+          <w:rFonts w:asciiTheme="minorBidi" w:hAnsiTheme="minorBidi" w:cstheme="minorBidi"/>
+          <w:sz w:val="24"/>
+          <w:szCs w:val="24"/>
+        </w:rPr>
+        <w:t>OrderDto</w:t>
+      </w:r>
+      <w:proofErr w:type="spellEnd"/>
+      <w:r>
+        <w:rPr>
+          <w:rFonts w:asciiTheme="minorBidi" w:hAnsiTheme="minorBidi" w:cstheme="minorBidi"/>
+          <w:sz w:val="24"/>
+          <w:szCs w:val="24"/>
+        </w:rPr>
+        <w:t xml:space="preserve">, </w:t>
+      </w:r>
+      <w:proofErr w:type="spellStart"/>
+      <w:r>
+        <w:rPr>
+          <w:rFonts w:asciiTheme="minorBidi" w:hAnsiTheme="minorBidi" w:cstheme="minorBidi"/>
+          <w:sz w:val="24"/>
+          <w:szCs w:val="24"/>
+        </w:rPr>
+        <w:t>ParticipantDto</w:t>
+      </w:r>
+      <w:proofErr w:type="spellEnd"/>
+      <w:r>
+        <w:rPr>
+          <w:rFonts w:asciiTheme="minorBidi" w:hAnsiTheme="minorBidi" w:cstheme="minorBidi"/>
+          <w:sz w:val="24"/>
+          <w:szCs w:val="24"/>
+        </w:rPr>
+        <w:t xml:space="preserve">, </w:t>
+      </w:r>
+      <w:proofErr w:type="spellStart"/>
+      <w:r>
+        <w:rPr>
+          <w:rFonts w:asciiTheme="minorBidi" w:hAnsiTheme="minorBidi" w:cstheme="minorBidi"/>
+          <w:sz w:val="24"/>
+          <w:szCs w:val="24"/>
+        </w:rPr>
+        <w:t>ParticipationDto</w:t>
+      </w:r>
+      <w:proofErr w:type="spellEnd"/>
+      <w:r>
+        <w:rPr>
+          <w:rFonts w:asciiTheme="minorBidi" w:hAnsiTheme="minorBidi" w:cstheme="minorBidi"/>
+          <w:sz w:val="24"/>
+          <w:szCs w:val="24"/>
+        </w:rPr>
+        <w:t xml:space="preserve">, </w:t>
+      </w:r>
+      <w:proofErr w:type="spellStart"/>
+      <w:r>
+        <w:rPr>
+          <w:rFonts w:asciiTheme="minorBidi" w:hAnsiTheme="minorBidi" w:cstheme="minorBidi"/>
+          <w:sz w:val="24"/>
+          <w:szCs w:val="24"/>
+        </w:rPr>
+        <w:t>TradeDto</w:t>
+      </w:r>
+      <w:proofErr w:type="spellEnd"/>
+      <w:r>
+        <w:rPr>
+          <w:rFonts w:asciiTheme="minorBidi" w:hAnsiTheme="minorBidi" w:cstheme="minorBidi"/>
+          <w:sz w:val="24"/>
+          <w:szCs w:val="24"/>
+        </w:rPr>
+        <w:t xml:space="preserve">, </w:t>
+      </w:r>
+      <w:proofErr w:type="spellStart"/>
+      <w:r>
+        <w:rPr>
+          <w:rFonts w:asciiTheme="minorBidi" w:hAnsiTheme="minorBidi" w:cstheme="minorBidi"/>
+          <w:sz w:val="24"/>
+          <w:szCs w:val="24"/>
+        </w:rPr>
+        <w:t>TradeResultDto</w:t>
+      </w:r>
+      <w:proofErr w:type="spellEnd"/>
+      <w:r>
+        <w:rPr>
+          <w:rFonts w:asciiTheme="minorBidi" w:hAnsiTheme="minorBidi" w:cstheme="minorBidi"/>
+          <w:sz w:val="24"/>
+          <w:szCs w:val="24"/>
+        </w:rPr>
+        <w:t xml:space="preserve">, </w:t>
+      </w:r>
+      <w:proofErr w:type="spellStart"/>
+      <w:r>
+        <w:rPr>
+          <w:rFonts w:asciiTheme="minorBidi" w:hAnsiTheme="minorBidi" w:cstheme="minorBidi"/>
+          <w:sz w:val="24"/>
+          <w:szCs w:val="24"/>
+        </w:rPr>
+        <w:t>UserDto</w:t>
+      </w:r>
+      <w:proofErr w:type="spellEnd"/>
+      <w:r>
+        <w:rPr>
+          <w:rFonts w:asciiTheme="minorBidi" w:hAnsiTheme="minorBidi" w:cstheme="minorBidi"/>
+          <w:sz w:val="24"/>
+          <w:szCs w:val="24"/>
+        </w:rPr>
+        <w:t xml:space="preserve">, </w:t>
+      </w:r>
+      <w:proofErr w:type="spellStart"/>
+      <w:r>
+        <w:rPr>
+          <w:rFonts w:asciiTheme="minorBidi" w:hAnsiTheme="minorBidi" w:cstheme="minorBidi"/>
+          <w:sz w:val="24"/>
+          <w:szCs w:val="24"/>
+        </w:rPr>
+        <w:t>OptionStateDto</w:t>
+      </w:r>
+      <w:proofErr w:type="spellEnd"/>
+      <w:r>
+        <w:rPr>
+          <w:rFonts w:asciiTheme="minorBidi" w:hAnsiTheme="minorBidi" w:cstheme="minorBidi"/>
+          <w:sz w:val="24"/>
+          <w:szCs w:val="24"/>
+        </w:rPr>
+        <w:t>) - plain read-only carriers so the UI never touches the engine's internal model classes.</w:t>
       </w:r>
     </w:p>
     <w:p>
       <w:pPr>
         <w:pStyle w:val="Heading2"/>
         <w:spacing w:before="240" w:after="120"/>
-      </w:pPr>
-      <w:r>
+        <w:rPr>
+          <w:rFonts w:asciiTheme="minorBidi" w:hAnsiTheme="minorBidi" w:cstheme="minorBidi"/>
+        </w:rPr>
+      </w:pPr>
+      <w:proofErr w:type="spellStart"/>
+      <w:r>
+        <w:rPr>
+          <w:rFonts w:asciiTheme="minorBidi" w:hAnsiTheme="minorBidi" w:cstheme="minorBidi"/>
+        </w:rPr>
         <w:t>ui</w:t>
       </w:r>
+      <w:proofErr w:type="spellEnd"/>
     </w:p>
     <w:tbl>
       <w:tblPr>
@@ -1819,12 +1709,6 @@
         <w:gridCol w:w="7552"/>
       </w:tblGrid>
       <w:tr>
-        <w:tblPrEx>
-          <w:tblCellMar>
-            <w:top w:w="0" w:type="dxa"/>
-            <w:bottom w:w="0" w:type="dxa"/>
-          </w:tblCellMar>
-        </w:tblPrEx>
         <w:trPr>
           <w:trHeight w:val="337"/>
         </w:trPr>
@@ -1860,12 +1744,6 @@
         </w:tc>
       </w:tr>
       <w:tr>
-        <w:tblPrEx>
-          <w:tblCellMar>
-            <w:top w:w="0" w:type="dxa"/>
-            <w:bottom w:w="0" w:type="dxa"/>
-          </w:tblCellMar>
-        </w:tblPrEx>
         <w:trPr>
           <w:trHeight w:val="337"/>
         </w:trPr>
@@ -1881,6 +1759,7 @@
                 <w:szCs w:val="22"/>
               </w:rPr>
             </w:pPr>
+            <w:proofErr w:type="spellStart"/>
             <w:r>
               <w:rPr>
                 <w:rFonts w:asciiTheme="minorBidi" w:eastAsia="Consolas" w:hAnsiTheme="minorBidi" w:cstheme="minorBidi"/>
@@ -1889,6 +1768,7 @@
               </w:rPr>
               <w:t>MainApp</w:t>
             </w:r>
+            <w:proofErr w:type="spellEnd"/>
           </w:p>
         </w:tc>
         <w:tc>
@@ -1909,34 +1789,30 @@
                 <w:sz w:val="22"/>
                 <w:szCs w:val="22"/>
               </w:rPr>
-              <w:t>JavaFX entry point</w:t>
-            </w:r>
-            <w:r>
-              <w:rPr>
-                <w:rFonts w:asciiTheme="minorBidi" w:hAnsiTheme="minorBidi" w:cstheme="minorBidi"/>
-                <w:sz w:val="22"/>
-                <w:szCs w:val="22"/>
-              </w:rPr>
-              <w:t xml:space="preserve">. </w:t>
-            </w:r>
-            <w:r>
-              <w:rPr>
-                <w:rFonts w:asciiTheme="minorBidi" w:hAnsiTheme="minorBidi" w:cstheme="minorBidi"/>
-                <w:sz w:val="22"/>
-                <w:szCs w:val="22"/>
-              </w:rPr>
-              <w:t>loads main.fxml and wires the engine into the controller.</w:t>
+              <w:t xml:space="preserve">JavaFX entry point. loads </w:t>
+            </w:r>
+            <w:proofErr w:type="spellStart"/>
+            <w:r>
+              <w:rPr>
+                <w:rFonts w:asciiTheme="minorBidi" w:hAnsiTheme="minorBidi" w:cstheme="minorBidi"/>
+                <w:sz w:val="22"/>
+                <w:szCs w:val="22"/>
+              </w:rPr>
+              <w:t>main.fxml</w:t>
+            </w:r>
+            <w:proofErr w:type="spellEnd"/>
+            <w:r>
+              <w:rPr>
+                <w:rFonts w:asciiTheme="minorBidi" w:hAnsiTheme="minorBidi" w:cstheme="minorBidi"/>
+                <w:sz w:val="22"/>
+                <w:szCs w:val="22"/>
+              </w:rPr>
+              <w:t xml:space="preserve"> and wires the engine into the controller.</w:t>
             </w:r>
           </w:p>
         </w:tc>
       </w:tr>
       <w:tr>
-        <w:tblPrEx>
-          <w:tblCellMar>
-            <w:top w:w="0" w:type="dxa"/>
-            <w:bottom w:w="0" w:type="dxa"/>
-          </w:tblCellMar>
-        </w:tblPrEx>
         <w:trPr>
           <w:trHeight w:val="674"/>
         </w:trPr>
@@ -1952,6 +1828,7 @@
                 <w:szCs w:val="22"/>
               </w:rPr>
             </w:pPr>
+            <w:proofErr w:type="spellStart"/>
             <w:r>
               <w:rPr>
                 <w:rFonts w:asciiTheme="minorBidi" w:eastAsia="Consolas" w:hAnsiTheme="minorBidi" w:cstheme="minorBidi"/>
@@ -1960,6 +1837,7 @@
               </w:rPr>
               <w:t>MainController</w:t>
             </w:r>
+            <w:proofErr w:type="spellEnd"/>
           </w:p>
         </w:tc>
         <w:tc>
@@ -1980,34 +1858,12 @@
                 <w:sz w:val="22"/>
                 <w:szCs w:val="22"/>
               </w:rPr>
-              <w:t xml:space="preserve">All UI logic </w:t>
-            </w:r>
-            <w:r>
-              <w:rPr>
-                <w:rFonts w:asciiTheme="minorBidi" w:hAnsiTheme="minorBidi" w:cstheme="minorBidi"/>
-                <w:sz w:val="22"/>
-                <w:szCs w:val="22"/>
-              </w:rPr>
-              <w:t>-</w:t>
-            </w:r>
-            <w:r>
-              <w:rPr>
-                <w:rFonts w:asciiTheme="minorBidi" w:hAnsiTheme="minorBidi" w:cstheme="minorBidi"/>
-                <w:sz w:val="22"/>
-                <w:szCs w:val="22"/>
-              </w:rPr>
-              <w:t xml:space="preserve"> file loading, the events and users tabs, filtering, the trading action forms, and the bonuses.</w:t>
+              <w:t>All UI logic - file loading, the events and users tabs, filtering, the trading action forms, and the bonuses.</w:t>
             </w:r>
           </w:p>
         </w:tc>
       </w:tr>
       <w:tr>
-        <w:tblPrEx>
-          <w:tblCellMar>
-            <w:top w:w="0" w:type="dxa"/>
-            <w:bottom w:w="0" w:type="dxa"/>
-          </w:tblCellMar>
-        </w:tblPrEx>
         <w:trPr>
           <w:trHeight w:val="674"/>
         </w:trPr>
@@ -2022,6 +1878,7 @@
                 <w:szCs w:val="22"/>
               </w:rPr>
             </w:pPr>
+            <w:proofErr w:type="spellStart"/>
             <w:r>
               <w:rPr>
                 <w:rFonts w:asciiTheme="minorBidi" w:eastAsia="Consolas" w:hAnsiTheme="minorBidi" w:cstheme="minorBidi"/>
@@ -2030,6 +1887,7 @@
               </w:rPr>
               <w:t>EventRow</w:t>
             </w:r>
+            <w:proofErr w:type="spellEnd"/>
             <w:r>
               <w:rPr>
                 <w:rFonts w:ascii="Consolas" w:eastAsia="Consolas" w:hAnsi="Consolas" w:cs="Consolas"/>
@@ -2038,6 +1896,7 @@
               </w:rPr>
               <w:t xml:space="preserve"> / </w:t>
             </w:r>
+            <w:proofErr w:type="spellStart"/>
             <w:r>
               <w:rPr>
                 <w:rFonts w:asciiTheme="minorBidi" w:eastAsia="Consolas" w:hAnsiTheme="minorBidi" w:cstheme="minorBidi"/>
@@ -2046,6 +1905,7 @@
               </w:rPr>
               <w:t>UserRow</w:t>
             </w:r>
+            <w:proofErr w:type="spellEnd"/>
           </w:p>
         </w:tc>
         <w:tc>
@@ -2065,8 +1925,54 @@
                 <w:sz w:val="22"/>
                 <w:szCs w:val="22"/>
               </w:rPr>
-              <w:t>Thin wrappers exposing EventDto/UserDto as JavaFX properties for the TableViews</w:t>
-            </w:r>
+              <w:t xml:space="preserve">Thin wrappers exposing </w:t>
+            </w:r>
+            <w:proofErr w:type="spellStart"/>
+            <w:r>
+              <w:rPr>
+                <w:rFonts w:asciiTheme="minorBidi" w:hAnsiTheme="minorBidi" w:cstheme="minorBidi"/>
+                <w:sz w:val="22"/>
+                <w:szCs w:val="22"/>
+              </w:rPr>
+              <w:t>EventDto</w:t>
+            </w:r>
+            <w:proofErr w:type="spellEnd"/>
+            <w:r>
+              <w:rPr>
+                <w:rFonts w:asciiTheme="minorBidi" w:hAnsiTheme="minorBidi" w:cstheme="minorBidi"/>
+                <w:sz w:val="22"/>
+                <w:szCs w:val="22"/>
+              </w:rPr>
+              <w:t>/</w:t>
+            </w:r>
+            <w:proofErr w:type="spellStart"/>
+            <w:r>
+              <w:rPr>
+                <w:rFonts w:asciiTheme="minorBidi" w:hAnsiTheme="minorBidi" w:cstheme="minorBidi"/>
+                <w:sz w:val="22"/>
+                <w:szCs w:val="22"/>
+              </w:rPr>
+              <w:t>UserDto</w:t>
+            </w:r>
+            <w:proofErr w:type="spellEnd"/>
+            <w:r>
+              <w:rPr>
+                <w:rFonts w:asciiTheme="minorBidi" w:hAnsiTheme="minorBidi" w:cstheme="minorBidi"/>
+                <w:sz w:val="22"/>
+                <w:szCs w:val="22"/>
+              </w:rPr>
+              <w:t xml:space="preserve"> as JavaFX properties for the </w:t>
+            </w:r>
+            <w:proofErr w:type="spellStart"/>
+            <w:r>
+              <w:rPr>
+                <w:rFonts w:asciiTheme="minorBidi" w:hAnsiTheme="minorBidi" w:cstheme="minorBidi"/>
+                <w:sz w:val="22"/>
+                <w:szCs w:val="22"/>
+              </w:rPr>
+              <w:t>TableViews</w:t>
+            </w:r>
+            <w:proofErr w:type="spellEnd"/>
             <w:r>
               <w:rPr>
                 <w:sz w:val="22"/>
@@ -2090,9 +1996,15 @@
       <w:pPr>
         <w:pStyle w:val="Heading1"/>
         <w:spacing w:before="300" w:after="150"/>
-      </w:pPr>
-      <w:r>
-        <w:t>Decisions made where the spec left a choice</w:t>
+        <w:rPr>
+          <w:rFonts w:asciiTheme="minorBidi" w:hAnsiTheme="minorBidi" w:cstheme="minorBidi"/>
+        </w:rPr>
+      </w:pPr>
+      <w:r>
+        <w:rPr>
+          <w:rFonts w:asciiTheme="minorBidi" w:hAnsiTheme="minorBidi" w:cstheme="minorBidi"/>
+        </w:rPr>
+        <w:t>Assumptions and decisions</w:t>
       </w:r>
     </w:p>
     <w:p>
@@ -2100,7 +2012,7 @@
         <w:pStyle w:val="ListParagraph"/>
         <w:numPr>
           <w:ilvl w:val="0"/>
-          <w:numId w:val="2"/>
+          <w:numId w:val="4"/>
         </w:numPr>
         <w:spacing w:after="60"/>
         <w:rPr>
@@ -2115,23 +2027,7 @@
           <w:sz w:val="24"/>
           <w:szCs w:val="24"/>
         </w:rPr>
-        <w:t xml:space="preserve">Commissions (both on-purchase and on-close) are paid straight into the market maker's account the moment they're charged </w:t>
-      </w:r>
-      <w:r>
-        <w:rPr>
-          <w:rFonts w:asciiTheme="minorBidi" w:hAnsiTheme="minorBidi" w:cstheme="minorBidi"/>
-          <w:sz w:val="24"/>
-          <w:szCs w:val="24"/>
-        </w:rPr>
-        <w:t>-</w:t>
-      </w:r>
-      <w:r>
-        <w:rPr>
-          <w:rFonts w:asciiTheme="minorBidi" w:hAnsiTheme="minorBidi" w:cstheme="minorBidi"/>
-          <w:sz w:val="24"/>
-          <w:szCs w:val="24"/>
-        </w:rPr>
-        <w:t xml:space="preserve"> they never sit in the event's own account.</w:t>
+        <w:t>A file that is loaded successfully replaces the file that was loaded before it. Nothing from the previous file stays in the system.</w:t>
       </w:r>
     </w:p>
     <w:p>
@@ -2139,7 +2035,7 @@
         <w:pStyle w:val="ListParagraph"/>
         <w:numPr>
           <w:ilvl w:val="0"/>
-          <w:numId w:val="2"/>
+          <w:numId w:val="4"/>
         </w:numPr>
         <w:spacing w:after="60"/>
         <w:rPr>
@@ -2148,13 +2044,55 @@
           <w:szCs w:val="24"/>
         </w:rPr>
       </w:pPr>
-      <w:r>
-        <w:rPr>
-          <w:rFonts w:asciiTheme="minorBidi" w:hAnsiTheme="minorBidi" w:cstheme="minorBidi"/>
-          <w:sz w:val="24"/>
-          <w:szCs w:val="24"/>
-        </w:rPr>
-        <w:t>Mint only triggers between two resting BUY orders on the two opposite options whose prices together reach the base value d, as described in Appendix B. A sell order is never involved in a mint.</w:t>
+      <w:proofErr w:type="gramStart"/>
+      <w:r>
+        <w:rPr>
+          <w:rFonts w:asciiTheme="minorBidi" w:hAnsiTheme="minorBidi" w:cstheme="minorBidi"/>
+          <w:sz w:val="24"/>
+          <w:szCs w:val="24"/>
+        </w:rPr>
+        <w:t>User names</w:t>
+      </w:r>
+      <w:proofErr w:type="gramEnd"/>
+      <w:r>
+        <w:rPr>
+          <w:rFonts w:asciiTheme="minorBidi" w:hAnsiTheme="minorBidi" w:cstheme="minorBidi"/>
+          <w:sz w:val="24"/>
+          <w:szCs w:val="24"/>
+        </w:rPr>
+        <w:t xml:space="preserve"> must be unique, and the comparison is done without case sensitivity. Event names must be unique too, the same way - trying to create a new event (in </w:t>
+      </w:r>
+      <w:r>
+        <w:rPr>
+          <w:rFonts w:asciiTheme="minorBidi" w:hAnsiTheme="minorBidi" w:cstheme="minorBidi"/>
+          <w:sz w:val="24"/>
+          <w:szCs w:val="24"/>
+        </w:rPr>
+        <w:t>the event creation</w:t>
+      </w:r>
+      <w:r>
+        <w:rPr>
+          <w:rFonts w:asciiTheme="minorBidi" w:hAnsiTheme="minorBidi" w:cstheme="minorBidi"/>
+          <w:sz w:val="24"/>
+          <w:szCs w:val="24"/>
+        </w:rPr>
+        <w:t xml:space="preserve"> bonus</w:t>
+      </w:r>
+      <w:r>
+        <w:rPr>
+          <w:rFonts w:asciiTheme="minorBidi" w:hAnsiTheme="minorBidi" w:cstheme="minorBidi"/>
+          <w:sz w:val="24"/>
+          <w:szCs w:val="24"/>
+        </w:rPr>
+        <w:t xml:space="preserve"> feature</w:t>
+      </w:r>
+      <w:r>
+        <w:rPr>
+          <w:rFonts w:asciiTheme="minorBidi" w:hAnsiTheme="minorBidi" w:cstheme="minorBidi"/>
+          <w:sz w:val="24"/>
+          <w:szCs w:val="24"/>
+        </w:rPr>
+        <w:t>) with a name that already exists is rejected with a clear error message and the event is not created.</w:t>
       </w:r>
     </w:p>
     <w:p>
@@ -2162,7 +2100,7 @@
         <w:pStyle w:val="ListParagraph"/>
         <w:numPr>
           <w:ilvl w:val="0"/>
-          <w:numId w:val="2"/>
+          <w:numId w:val="4"/>
         </w:numPr>
         <w:spacing w:after="60"/>
         <w:rPr>
@@ -2177,7 +2115,7 @@
           <w:sz w:val="24"/>
           <w:szCs w:val="24"/>
         </w:rPr>
-        <w:t>Order matching is price-then-time priority: an incoming order can consume several resting orders in sequence if needed to fill.</w:t>
+        <w:t>Commissions, both on-purchase and on-close, are paid straight into the account of the market maker at the moment they are charged. They never sit in the account of the event.</w:t>
       </w:r>
     </w:p>
     <w:p>
@@ -2185,7 +2123,7 @@
         <w:pStyle w:val="ListParagraph"/>
         <w:numPr>
           <w:ilvl w:val="0"/>
-          <w:numId w:val="2"/>
+          <w:numId w:val="4"/>
         </w:numPr>
         <w:spacing w:after="60"/>
         <w:rPr>
@@ -2200,7 +2138,7 @@
           <w:sz w:val="24"/>
           <w:szCs w:val="24"/>
         </w:rPr>
-        <w:t>Opening an Order Book event gives the market maker initial/d pairs of shares, each pair costed at d/2 per share for the purpose of the “net paid” figures shown in the UI.</w:t>
+        <w:t>Mint only happens between two resting BUY orders on the two opposite options, when their prices together reach the base value d, as written in Appendix B. A sell order is never part of a mint.</w:t>
       </w:r>
     </w:p>
     <w:p>
@@ -2208,7 +2146,7 @@
         <w:pStyle w:val="ListParagraph"/>
         <w:numPr>
           <w:ilvl w:val="0"/>
-          <w:numId w:val="2"/>
+          <w:numId w:val="4"/>
         </w:numPr>
         <w:spacing w:after="60"/>
         <w:rPr>
@@ -2223,39 +2161,410 @@
           <w:sz w:val="24"/>
           <w:szCs w:val="24"/>
         </w:rPr>
-        <w:t xml:space="preserve">The LMSR participation view for a single user also shows the event-wide totals (shares bought per option, and the winner) once the event is closed </w:t>
-      </w:r>
-      <w:r>
-        <w:rPr>
-          <w:rFonts w:asciiTheme="minorBidi" w:hAnsiTheme="minorBidi" w:cstheme="minorBidi"/>
-          <w:sz w:val="24"/>
-          <w:szCs w:val="24"/>
-        </w:rPr>
-        <w:t>-</w:t>
-      </w:r>
-      <w:r>
-        <w:rPr>
-          <w:rFonts w:asciiTheme="minorBidi" w:hAnsiTheme="minorBidi" w:cstheme="minorBidi"/>
-          <w:sz w:val="24"/>
-          <w:szCs w:val="24"/>
-        </w:rPr>
-        <w:t xml:space="preserve"> not just that user's own trades </w:t>
-      </w:r>
-      <w:r>
-        <w:rPr>
-          <w:rFonts w:asciiTheme="minorBidi" w:hAnsiTheme="minorBidi" w:cstheme="minorBidi"/>
-          <w:sz w:val="24"/>
-          <w:szCs w:val="24"/>
-        </w:rPr>
-        <w:t>-</w:t>
-      </w:r>
-      <w:r>
-        <w:rPr>
-          <w:rFonts w:asciiTheme="minorBidi" w:hAnsiTheme="minorBidi" w:cstheme="minorBidi"/>
-          <w:sz w:val="24"/>
-          <w:szCs w:val="24"/>
-        </w:rPr>
-        <w:t xml:space="preserve"> matching the wording in the assignment.</w:t>
+        <w:t>Order matching is by price and then by time. One incoming order can consume several resting orders one after the other until it is filled.</w:t>
+      </w:r>
+    </w:p>
+    <w:p>
+      <w:pPr>
+        <w:pStyle w:val="ListParagraph"/>
+        <w:numPr>
+          <w:ilvl w:val="0"/>
+          <w:numId w:val="4"/>
+        </w:numPr>
+        <w:spacing w:after="60"/>
+        <w:rPr>
+          <w:rFonts w:asciiTheme="minorBidi" w:hAnsiTheme="minorBidi" w:cstheme="minorBidi"/>
+          <w:sz w:val="24"/>
+          <w:szCs w:val="24"/>
+        </w:rPr>
+      </w:pPr>
+      <w:r>
+        <w:rPr>
+          <w:rFonts w:asciiTheme="minorBidi" w:hAnsiTheme="minorBidi" w:cstheme="minorBidi"/>
+          <w:sz w:val="24"/>
+          <w:szCs w:val="24"/>
+        </w:rPr>
+        <w:t xml:space="preserve">An order price </w:t>
+      </w:r>
+      <w:proofErr w:type="gramStart"/>
+      <w:r>
+        <w:rPr>
+          <w:rFonts w:asciiTheme="minorBidi" w:hAnsiTheme="minorBidi" w:cstheme="minorBidi"/>
+          <w:sz w:val="24"/>
+          <w:szCs w:val="24"/>
+        </w:rPr>
+        <w:t>can not</w:t>
+      </w:r>
+      <w:proofErr w:type="gramEnd"/>
+      <w:r>
+        <w:rPr>
+          <w:rFonts w:asciiTheme="minorBidi" w:hAnsiTheme="minorBidi" w:cstheme="minorBidi"/>
+          <w:sz w:val="24"/>
+          <w:szCs w:val="24"/>
+        </w:rPr>
+        <w:t xml:space="preserve"> be higher </w:t>
+      </w:r>
+      <w:proofErr w:type="gramStart"/>
+      <w:r>
+        <w:rPr>
+          <w:rFonts w:asciiTheme="minorBidi" w:hAnsiTheme="minorBidi" w:cstheme="minorBidi"/>
+          <w:sz w:val="24"/>
+          <w:szCs w:val="24"/>
+        </w:rPr>
+        <w:t>than d</w:t>
+      </w:r>
+      <w:proofErr w:type="gramEnd"/>
+      <w:r>
+        <w:rPr>
+          <w:rFonts w:asciiTheme="minorBidi" w:hAnsiTheme="minorBidi" w:cstheme="minorBidi"/>
+          <w:sz w:val="24"/>
+          <w:szCs w:val="24"/>
+        </w:rPr>
+        <w:t xml:space="preserve"> minus 0.01, and the quantity and the price must both be positive.</w:t>
+      </w:r>
+    </w:p>
+    <w:p>
+      <w:pPr>
+        <w:pStyle w:val="ListParagraph"/>
+        <w:numPr>
+          <w:ilvl w:val="0"/>
+          <w:numId w:val="4"/>
+        </w:numPr>
+        <w:spacing w:after="60"/>
+        <w:rPr>
+          <w:rFonts w:asciiTheme="minorBidi" w:hAnsiTheme="minorBidi" w:cstheme="minorBidi"/>
+          <w:sz w:val="24"/>
+          <w:szCs w:val="24"/>
+        </w:rPr>
+      </w:pPr>
+      <w:r>
+        <w:rPr>
+          <w:rFonts w:asciiTheme="minorBidi" w:hAnsiTheme="minorBidi" w:cstheme="minorBidi"/>
+          <w:sz w:val="24"/>
+          <w:szCs w:val="24"/>
+        </w:rPr>
+        <w:t>Opening an Order Book event gives the market maker initial/d pairs of shares. Every pair is counted at d/2 for each share, for the “net paid” numbers that are shown in the screens.</w:t>
+      </w:r>
+    </w:p>
+    <w:p>
+      <w:pPr>
+        <w:pStyle w:val="ListParagraph"/>
+        <w:numPr>
+          <w:ilvl w:val="0"/>
+          <w:numId w:val="4"/>
+        </w:numPr>
+        <w:spacing w:after="60"/>
+        <w:rPr>
+          <w:rFonts w:asciiTheme="minorBidi" w:hAnsiTheme="minorBidi" w:cstheme="minorBidi"/>
+          <w:sz w:val="24"/>
+          <w:szCs w:val="24"/>
+        </w:rPr>
+      </w:pPr>
+      <w:r>
+        <w:rPr>
+          <w:rFonts w:asciiTheme="minorBidi" w:hAnsiTheme="minorBidi" w:cstheme="minorBidi"/>
+          <w:sz w:val="24"/>
+          <w:szCs w:val="24"/>
+        </w:rPr>
+        <w:t>The LMSR participation view of a single user also shows the totals of the whole event once it is closed - the shares that were bought from every option, and the winner - and not only the trades of that user. This follows the wording of the exercise.</w:t>
+      </w:r>
+    </w:p>
+    <w:p>
+      <w:pPr>
+        <w:pStyle w:val="ListParagraph"/>
+        <w:numPr>
+          <w:ilvl w:val="0"/>
+          <w:numId w:val="4"/>
+        </w:numPr>
+        <w:spacing w:after="60"/>
+        <w:rPr>
+          <w:rFonts w:asciiTheme="minorBidi" w:hAnsiTheme="minorBidi" w:cstheme="minorBidi"/>
+          <w:sz w:val="24"/>
+          <w:szCs w:val="24"/>
+        </w:rPr>
+      </w:pPr>
+      <w:r>
+        <w:rPr>
+          <w:rFonts w:asciiTheme="minorBidi" w:hAnsiTheme="minorBidi" w:cstheme="minorBidi"/>
+          <w:sz w:val="24"/>
+          <w:szCs w:val="24"/>
+        </w:rPr>
+        <w:t xml:space="preserve">A user whose balance would become negative is blocked for good and </w:t>
+      </w:r>
+      <w:proofErr w:type="gramStart"/>
+      <w:r>
+        <w:rPr>
+          <w:rFonts w:asciiTheme="minorBidi" w:hAnsiTheme="minorBidi" w:cstheme="minorBidi"/>
+          <w:sz w:val="24"/>
+          <w:szCs w:val="24"/>
+        </w:rPr>
+        <w:t>can not</w:t>
+      </w:r>
+      <w:proofErr w:type="gramEnd"/>
+      <w:r>
+        <w:rPr>
+          <w:rFonts w:asciiTheme="minorBidi" w:hAnsiTheme="minorBidi" w:cstheme="minorBidi"/>
+          <w:sz w:val="24"/>
+          <w:szCs w:val="24"/>
+        </w:rPr>
+        <w:t xml:space="preserve"> act again, in any event and also as a market maker.</w:t>
+      </w:r>
+    </w:p>
+    <w:p>
+      <w:pPr>
+        <w:pStyle w:val="ListParagraph"/>
+        <w:numPr>
+          <w:ilvl w:val="0"/>
+          <w:numId w:val="4"/>
+        </w:numPr>
+        <w:spacing w:after="60"/>
+        <w:rPr>
+          <w:rFonts w:asciiTheme="minorBidi" w:hAnsiTheme="minorBidi" w:cstheme="minorBidi"/>
+          <w:sz w:val="24"/>
+          <w:szCs w:val="24"/>
+        </w:rPr>
+      </w:pPr>
+      <w:r>
+        <w:rPr>
+          <w:rFonts w:asciiTheme="minorBidi" w:hAnsiTheme="minorBidi" w:cstheme="minorBidi"/>
+          <w:sz w:val="24"/>
+          <w:szCs w:val="24"/>
+        </w:rPr>
+        <w:t xml:space="preserve">An event that was closed </w:t>
+      </w:r>
+      <w:proofErr w:type="gramStart"/>
+      <w:r>
+        <w:rPr>
+          <w:rFonts w:asciiTheme="minorBidi" w:hAnsiTheme="minorBidi" w:cstheme="minorBidi"/>
+          <w:sz w:val="24"/>
+          <w:szCs w:val="24"/>
+        </w:rPr>
+        <w:t>can not</w:t>
+      </w:r>
+      <w:proofErr w:type="gramEnd"/>
+      <w:r>
+        <w:rPr>
+          <w:rFonts w:asciiTheme="minorBidi" w:hAnsiTheme="minorBidi" w:cstheme="minorBidi"/>
+          <w:sz w:val="24"/>
+          <w:szCs w:val="24"/>
+        </w:rPr>
+        <w:t xml:space="preserve"> be traded in and </w:t>
+      </w:r>
+      <w:proofErr w:type="gramStart"/>
+      <w:r>
+        <w:rPr>
+          <w:rFonts w:asciiTheme="minorBidi" w:hAnsiTheme="minorBidi" w:cstheme="minorBidi"/>
+          <w:sz w:val="24"/>
+          <w:szCs w:val="24"/>
+        </w:rPr>
+        <w:t>can not</w:t>
+      </w:r>
+      <w:proofErr w:type="gramEnd"/>
+      <w:r>
+        <w:rPr>
+          <w:rFonts w:asciiTheme="minorBidi" w:hAnsiTheme="minorBidi" w:cstheme="minorBidi"/>
+          <w:sz w:val="24"/>
+          <w:szCs w:val="24"/>
+        </w:rPr>
+        <w:t xml:space="preserve"> be closed again.</w:t>
+      </w:r>
+    </w:p>
+    <w:p>
+      <w:pPr>
+        <w:pStyle w:val="ListParagraph"/>
+        <w:numPr>
+          <w:ilvl w:val="0"/>
+          <w:numId w:val="4"/>
+        </w:numPr>
+        <w:spacing w:after="60"/>
+        <w:rPr>
+          <w:rFonts w:asciiTheme="minorBidi" w:hAnsiTheme="minorBidi" w:cstheme="minorBidi"/>
+          <w:sz w:val="24"/>
+          <w:szCs w:val="24"/>
+        </w:rPr>
+      </w:pPr>
+      <w:r>
+        <w:rPr>
+          <w:rFonts w:asciiTheme="minorBidi" w:hAnsiTheme="minorBidi" w:cstheme="minorBidi"/>
+          <w:sz w:val="24"/>
+          <w:szCs w:val="24"/>
+        </w:rPr>
+        <w:lastRenderedPageBreak/>
+        <w:t>The market maker of an event may also trade in it, exactly like any other participant. When an Order Book event is opened, the market maker already holds the initial pairs of shares and is shown as “Market maker + participant” from that moment.</w:t>
+      </w:r>
+    </w:p>
+    <w:p>
+      <w:pPr>
+        <w:pStyle w:val="ListParagraph"/>
+        <w:numPr>
+          <w:ilvl w:val="0"/>
+          <w:numId w:val="4"/>
+        </w:numPr>
+        <w:spacing w:after="60"/>
+        <w:rPr>
+          <w:rFonts w:asciiTheme="minorBidi" w:hAnsiTheme="minorBidi" w:cstheme="minorBidi"/>
+          <w:sz w:val="24"/>
+          <w:szCs w:val="24"/>
+        </w:rPr>
+      </w:pPr>
+      <w:r>
+        <w:rPr>
+          <w:rFonts w:asciiTheme="minorBidi" w:hAnsiTheme="minorBidi" w:cstheme="minorBidi"/>
+          <w:sz w:val="24"/>
+          <w:szCs w:val="24"/>
+        </w:rPr>
+        <w:t>Decimal numbers are kept in full precision inside the engine and are rounded to two digits only when they are shown, so that the calculations will not drift.</w:t>
+      </w:r>
+    </w:p>
+    <w:p>
+      <w:pPr>
+        <w:pStyle w:val="ListParagraph"/>
+        <w:numPr>
+          <w:ilvl w:val="0"/>
+          <w:numId w:val="4"/>
+        </w:numPr>
+        <w:spacing w:after="60"/>
+        <w:rPr>
+          <w:rFonts w:asciiTheme="minorBidi" w:hAnsiTheme="minorBidi" w:cstheme="minorBidi"/>
+          <w:sz w:val="24"/>
+          <w:szCs w:val="24"/>
+        </w:rPr>
+      </w:pPr>
+      <w:r>
+        <w:rPr>
+          <w:rFonts w:asciiTheme="minorBidi" w:hAnsiTheme="minorBidi" w:cstheme="minorBidi"/>
+          <w:sz w:val="24"/>
+          <w:szCs w:val="24"/>
+        </w:rPr>
+        <w:t xml:space="preserve">Because the LMSR calculation uses the exponent function, the biggest </w:t>
+      </w:r>
+      <w:proofErr w:type="gramStart"/>
+      <w:r>
+        <w:rPr>
+          <w:rFonts w:asciiTheme="minorBidi" w:hAnsiTheme="minorBidi" w:cstheme="minorBidi"/>
+          <w:sz w:val="24"/>
+          <w:szCs w:val="24"/>
+        </w:rPr>
+        <w:t>amount</w:t>
+      </w:r>
+      <w:proofErr w:type="gramEnd"/>
+      <w:r>
+        <w:rPr>
+          <w:rFonts w:asciiTheme="minorBidi" w:hAnsiTheme="minorBidi" w:cstheme="minorBidi"/>
+          <w:sz w:val="24"/>
+          <w:szCs w:val="24"/>
+        </w:rPr>
+        <w:t xml:space="preserve"> of shares is taken out of the exponent before the calculation is made. Without it a very large purchase would turn the result into infinity and every number after it would be broken.</w:t>
+      </w:r>
+    </w:p>
+    <w:p>
+      <w:pPr>
+        <w:pStyle w:val="ListParagraph"/>
+        <w:numPr>
+          <w:ilvl w:val="0"/>
+          <w:numId w:val="4"/>
+        </w:numPr>
+        <w:spacing w:after="60"/>
+        <w:rPr>
+          <w:rFonts w:asciiTheme="minorBidi" w:hAnsiTheme="minorBidi" w:cstheme="minorBidi"/>
+          <w:sz w:val="24"/>
+          <w:szCs w:val="24"/>
+        </w:rPr>
+      </w:pPr>
+      <w:r>
+        <w:rPr>
+          <w:rFonts w:asciiTheme="minorBidi" w:hAnsiTheme="minorBidi" w:cstheme="minorBidi"/>
+          <w:sz w:val="24"/>
+          <w:szCs w:val="24"/>
+        </w:rPr>
+        <w:t xml:space="preserve">When the difference between the amounts of shares of the two options in an LMSR event becomes much larger than b, the value of the leading option converges to </w:t>
+      </w:r>
+      <w:proofErr w:type="gramStart"/>
+      <w:r>
+        <w:rPr>
+          <w:rFonts w:asciiTheme="minorBidi" w:hAnsiTheme="minorBidi" w:cstheme="minorBidi"/>
+          <w:sz w:val="24"/>
+          <w:szCs w:val="24"/>
+        </w:rPr>
+        <w:t>1.00</w:t>
+      </w:r>
+      <w:proofErr w:type="gramEnd"/>
+      <w:r>
+        <w:rPr>
+          <w:rFonts w:asciiTheme="minorBidi" w:hAnsiTheme="minorBidi" w:cstheme="minorBidi"/>
+          <w:sz w:val="24"/>
+          <w:szCs w:val="24"/>
+        </w:rPr>
+        <w:t xml:space="preserve"> and the value of the other one converges to 0.00. The real values are never exactly 1 and 0, but the difference from them becomes smaller than what a double can hold. This is a limitation of floating point arithmetic and not a mistake in the calculation.</w:t>
+      </w:r>
+    </w:p>
+    <w:p>
+      <w:pPr>
+        <w:pStyle w:val="ListParagraph"/>
+        <w:numPr>
+          <w:ilvl w:val="0"/>
+          <w:numId w:val="4"/>
+        </w:numPr>
+        <w:spacing w:after="60"/>
+        <w:rPr>
+          <w:rFonts w:asciiTheme="minorBidi" w:hAnsiTheme="minorBidi" w:cstheme="minorBidi"/>
+          <w:sz w:val="24"/>
+          <w:szCs w:val="24"/>
+        </w:rPr>
+      </w:pPr>
+      <w:r>
+        <w:rPr>
+          <w:rFonts w:asciiTheme="minorBidi" w:hAnsiTheme="minorBidi" w:cstheme="minorBidi"/>
+          <w:sz w:val="24"/>
+          <w:szCs w:val="24"/>
+        </w:rPr>
+        <w:t>The window has a minimum size of 780 by 520 pixels. Above that size the window is fully resizable, and every table and detail panel sits inside a ScrollPane, so nothing is cut off when the window is made small.</w:t>
+      </w:r>
+    </w:p>
+    <w:p>
+      <w:pPr>
+        <w:pStyle w:val="ListParagraph"/>
+        <w:numPr>
+          <w:ilvl w:val="0"/>
+          <w:numId w:val="4"/>
+        </w:numPr>
+        <w:spacing w:after="60"/>
+        <w:rPr>
+          <w:rFonts w:asciiTheme="minorBidi" w:hAnsiTheme="minorBidi" w:cstheme="minorBidi"/>
+          <w:sz w:val="24"/>
+          <w:szCs w:val="24"/>
+        </w:rPr>
+      </w:pPr>
+      <w:r>
+        <w:rPr>
+          <w:rFonts w:asciiTheme="minorBidi" w:hAnsiTheme="minorBidi" w:cstheme="minorBidi"/>
+          <w:sz w:val="24"/>
+          <w:szCs w:val="24"/>
+        </w:rPr>
+        <w:t>The delay of one to two seconds while a file is loading is on purpose, to make the progress of the JFX loading task visible, as the exercise asks.</w:t>
+      </w:r>
+    </w:p>
+    <w:p>
+      <w:pPr>
+        <w:pStyle w:val="ListParagraph"/>
+        <w:numPr>
+          <w:ilvl w:val="0"/>
+          <w:numId w:val="4"/>
+        </w:numPr>
+        <w:spacing w:after="60"/>
+        <w:rPr>
+          <w:rFonts w:asciiTheme="minorBidi" w:hAnsiTheme="minorBidi" w:cstheme="minorBidi"/>
+          <w:sz w:val="24"/>
+          <w:szCs w:val="24"/>
+        </w:rPr>
+      </w:pPr>
+      <w:r>
+        <w:rPr>
+          <w:rFonts w:asciiTheme="minorBidi" w:hAnsiTheme="minorBidi" w:cstheme="minorBidi"/>
+          <w:sz w:val="24"/>
+          <w:szCs w:val="24"/>
+        </w:rPr>
+        <w:t>The skins and the animations start turned off, as the exercise asks, and are turned on from the top bar.</w:t>
       </w:r>
     </w:p>
     <w:p>
@@ -2265,18 +2574,20 @@
         </w:pBdr>
         <w:spacing w:after="200"/>
         <w:ind w:left="100"/>
-        <w:rPr>
-          <w:rFonts w:hint="cs"/>
-          <w:rtl/>
-        </w:rPr>
       </w:pPr>
     </w:p>
     <w:p>
       <w:pPr>
         <w:pStyle w:val="Heading1"/>
         <w:spacing w:before="300" w:after="150"/>
-      </w:pPr>
-      <w:r>
+        <w:rPr>
+          <w:rFonts w:asciiTheme="minorBidi" w:hAnsiTheme="minorBidi" w:cstheme="minorBidi"/>
+        </w:rPr>
+      </w:pPr>
+      <w:r>
+        <w:rPr>
+          <w:rFonts w:asciiTheme="minorBidi" w:hAnsiTheme="minorBidi" w:cstheme="minorBidi"/>
+        </w:rPr>
         <w:t>Building and running</w:t>
       </w:r>
     </w:p>
@@ -2285,19 +2596,39 @@
         <w:spacing w:after="120"/>
         <w:rPr>
           <w:rFonts w:asciiTheme="minorBidi" w:hAnsiTheme="minorBidi" w:cstheme="minorBidi"/>
-          <w:sz w:val="24"/>
-          <w:szCs w:val="24"/>
-        </w:rPr>
-      </w:pPr>
-      <w:r>
-        <w:rPr>
-          <w:rFonts w:asciiTheme="minorBidi" w:hAnsiTheme="minorBidi" w:cstheme="minorBidi"/>
-          <w:i/>
-          <w:iCs/>
-          <w:sz w:val="24"/>
-          <w:szCs w:val="24"/>
-        </w:rPr>
-        <w:t>[[Finalize tomorrow once build.bat is updated for the ui/engine jars.]]</w:t>
+          <w:b/>
+          <w:bCs/>
+          <w:sz w:val="24"/>
+          <w:szCs w:val="24"/>
+        </w:rPr>
+      </w:pPr>
+      <w:r>
+        <w:rPr>
+          <w:rFonts w:asciiTheme="minorBidi" w:hAnsiTheme="minorBidi" w:cstheme="minorBidi"/>
+          <w:b/>
+          <w:bCs/>
+          <w:sz w:val="24"/>
+          <w:szCs w:val="24"/>
+        </w:rPr>
+        <w:t>Building</w:t>
+      </w:r>
+    </w:p>
+    <w:p>
+      <w:pPr>
+        <w:spacing w:after="120"/>
+        <w:rPr>
+          <w:rFonts w:asciiTheme="minorBidi" w:hAnsiTheme="minorBidi" w:cstheme="minorBidi"/>
+          <w:sz w:val="24"/>
+          <w:szCs w:val="24"/>
+        </w:rPr>
+      </w:pPr>
+      <w:r>
+        <w:rPr>
+          <w:rFonts w:asciiTheme="minorBidi" w:hAnsiTheme="minorBidi" w:cstheme="minorBidi"/>
+          <w:sz w:val="24"/>
+          <w:szCs w:val="24"/>
+        </w:rPr>
+        <w:t>Run the following from the repository root:</w:t>
       </w:r>
     </w:p>
     <w:p>
@@ -2309,49 +2640,137 @@
         <w:rPr>
           <w:rFonts w:ascii="Consolas" w:eastAsia="Consolas" w:hAnsi="Consolas" w:cs="Consolas"/>
         </w:rPr>
-        <w:t xml:space="preserve">build.bat            (creates </w:t>
+        <w:t>build.bat</w:t>
+      </w:r>
+    </w:p>
+    <w:p>
+      <w:pPr>
+        <w:spacing w:after="120"/>
+        <w:rPr>
+          <w:rFonts w:asciiTheme="minorBidi" w:hAnsiTheme="minorBidi" w:cstheme="minorBidi"/>
+          <w:sz w:val="24"/>
+          <w:szCs w:val="24"/>
+        </w:rPr>
+      </w:pPr>
+      <w:r>
+        <w:rPr>
+          <w:rFonts w:asciiTheme="minorBidi" w:hAnsiTheme="minorBidi" w:cstheme="minorBidi"/>
+          <w:sz w:val="24"/>
+          <w:szCs w:val="24"/>
+        </w:rPr>
+        <w:t xml:space="preserve">Requires JDK 25 installed and on the PATH. It compiles the engine and </w:t>
       </w:r>
       <w:proofErr w:type="spellStart"/>
       <w:r>
         <w:rPr>
-          <w:rFonts w:ascii="Consolas" w:eastAsia="Consolas" w:hAnsi="Consolas" w:cs="Consolas"/>
+          <w:rFonts w:asciiTheme="minorBidi" w:hAnsiTheme="minorBidi" w:cstheme="minorBidi"/>
+          <w:sz w:val="24"/>
+          <w:szCs w:val="24"/>
+        </w:rPr>
+        <w:t>ui</w:t>
+      </w:r>
+      <w:proofErr w:type="spellEnd"/>
+      <w:r>
+        <w:rPr>
+          <w:rFonts w:asciiTheme="minorBidi" w:hAnsiTheme="minorBidi" w:cstheme="minorBidi"/>
+          <w:sz w:val="24"/>
+          <w:szCs w:val="24"/>
+        </w:rPr>
+        <w:t xml:space="preserve"> modules with </w:t>
+      </w:r>
+      <w:proofErr w:type="spellStart"/>
+      <w:r>
+        <w:rPr>
+          <w:rFonts w:asciiTheme="minorBidi" w:hAnsiTheme="minorBidi" w:cstheme="minorBidi"/>
+          <w:sz w:val="24"/>
+          <w:szCs w:val="24"/>
+        </w:rPr>
+        <w:t>javac</w:t>
+      </w:r>
+      <w:proofErr w:type="spellEnd"/>
+      <w:r>
+        <w:rPr>
+          <w:rFonts w:asciiTheme="minorBidi" w:hAnsiTheme="minorBidi" w:cstheme="minorBidi"/>
+          <w:sz w:val="24"/>
+          <w:szCs w:val="24"/>
+        </w:rPr>
+        <w:t xml:space="preserve"> --release 25 and creates the </w:t>
+      </w:r>
+      <w:proofErr w:type="spellStart"/>
+      <w:r>
+        <w:rPr>
+          <w:rFonts w:asciiTheme="minorBidi" w:hAnsiTheme="minorBidi" w:cstheme="minorBidi"/>
+          <w:sz w:val="24"/>
+          <w:szCs w:val="24"/>
         </w:rPr>
         <w:t>dist</w:t>
       </w:r>
       <w:proofErr w:type="spellEnd"/>
       <w:r>
         <w:rPr>
-          <w:rFonts w:ascii="Consolas" w:eastAsia="Consolas" w:hAnsi="Consolas" w:cs="Consolas"/>
-        </w:rPr>
-        <w:t xml:space="preserve">\engine.jar, </w:t>
+          <w:rFonts w:asciiTheme="minorBidi" w:hAnsiTheme="minorBidi" w:cstheme="minorBidi"/>
+          <w:sz w:val="24"/>
+          <w:szCs w:val="24"/>
+        </w:rPr>
+        <w:t xml:space="preserve"> folder containing engine.jar, ui.jar, run.bat and a bundled </w:t>
       </w:r>
       <w:proofErr w:type="spellStart"/>
       <w:r>
         <w:rPr>
-          <w:rFonts w:ascii="Consolas" w:eastAsia="Consolas" w:hAnsi="Consolas" w:cs="Consolas"/>
-        </w:rPr>
-        <w:t>dist</w:t>
+          <w:rFonts w:asciiTheme="minorBidi" w:hAnsiTheme="minorBidi" w:cstheme="minorBidi"/>
+          <w:sz w:val="24"/>
+          <w:szCs w:val="24"/>
+        </w:rPr>
+        <w:t>javafx</w:t>
       </w:r>
       <w:proofErr w:type="spellEnd"/>
       <w:r>
         <w:rPr>
-          <w:rFonts w:ascii="Consolas" w:eastAsia="Consolas" w:hAnsi="Consolas" w:cs="Consolas"/>
-        </w:rPr>
-        <w:t xml:space="preserve">\ui.jar, </w:t>
+          <w:rFonts w:asciiTheme="minorBidi" w:hAnsiTheme="minorBidi" w:cstheme="minorBidi"/>
+          <w:sz w:val="24"/>
+          <w:szCs w:val="24"/>
+        </w:rPr>
+        <w:t xml:space="preserve">-runtime folder. ui.jar is the executable jar - its manifest declares Main-Class </w:t>
       </w:r>
       <w:proofErr w:type="spellStart"/>
       <w:r>
         <w:rPr>
-          <w:rFonts w:ascii="Consolas" w:eastAsia="Consolas" w:hAnsi="Consolas" w:cs="Consolas"/>
-        </w:rPr>
-        <w:t>dist</w:t>
+          <w:rFonts w:asciiTheme="minorBidi" w:hAnsiTheme="minorBidi" w:cstheme="minorBidi"/>
+          <w:sz w:val="24"/>
+          <w:szCs w:val="24"/>
+        </w:rPr>
+        <w:t>guessmarket.ui.MainApp</w:t>
       </w:r>
       <w:proofErr w:type="spellEnd"/>
       <w:r>
         <w:rPr>
-          <w:rFonts w:ascii="Consolas" w:eastAsia="Consolas" w:hAnsi="Consolas" w:cs="Consolas"/>
-        </w:rPr>
-        <w:t>\run.bat)</w:t>
+          <w:rFonts w:asciiTheme="minorBidi" w:hAnsiTheme="minorBidi" w:cstheme="minorBidi"/>
+          <w:sz w:val="24"/>
+          <w:szCs w:val="24"/>
+        </w:rPr>
+        <w:t xml:space="preserve"> and Class-Path engine.jar, so the two jars must stay in the same folder.</w:t>
+      </w:r>
+    </w:p>
+    <w:p>
+      <w:pPr>
+        <w:spacing w:after="120"/>
+        <w:rPr>
+          <w:rFonts w:asciiTheme="minorBidi" w:hAnsiTheme="minorBidi" w:cstheme="minorBidi"/>
+          <w:b/>
+          <w:bCs/>
+          <w:sz w:val="24"/>
+          <w:szCs w:val="24"/>
+        </w:rPr>
+      </w:pPr>
+      <w:r>
+        <w:rPr>
+          <w:rFonts w:asciiTheme="minorBidi" w:hAnsiTheme="minorBidi" w:cstheme="minorBidi"/>
+          <w:b/>
+          <w:bCs/>
+          <w:sz w:val="24"/>
+          <w:szCs w:val="24"/>
+        </w:rPr>
+        <w:t>Running</w:t>
       </w:r>
     </w:p>
     <w:p>
@@ -2398,38 +2817,145 @@
       <w:r>
         <w:rPr>
           <w:rFonts w:asciiTheme="minorBidi" w:hAnsiTheme="minorBidi" w:cstheme="minorBidi"/>
-          <w:i/>
-          <w:iCs/>
-          <w:sz w:val="24"/>
-          <w:szCs w:val="24"/>
-        </w:rPr>
-        <w:t>Requires a JavaFX SDK on the machine; run.bat sets --module-path/--add-modules automatically. [[Confirm exact JavaFX SDK folder name bundled/expected once packaging is finalized.]]</w:t>
-      </w:r>
-    </w:p>
-    <w:p>
-      <w:pPr>
-        <w:pBdr>
-          <w:bottom w:val="single" w:sz="6" w:space="4" w:color="AAAAAA"/>
-        </w:pBdr>
-        <w:spacing w:after="200"/>
-      </w:pPr>
-    </w:p>
-    <w:p>
-      <w:pPr>
-        <w:pStyle w:val="Heading1"/>
-        <w:spacing w:before="300" w:after="150"/>
-      </w:pPr>
-      <w:r>
-        <w:t>Known simplifications</w:t>
-      </w:r>
-    </w:p>
-    <w:p>
-      <w:pPr>
-        <w:pStyle w:val="ListParagraph"/>
-        <w:numPr>
-          <w:ilvl w:val="0"/>
-          <w:numId w:val="2"/>
-        </w:numPr>
+          <w:sz w:val="24"/>
+          <w:szCs w:val="24"/>
+        </w:rPr>
+        <w:t>No JavaFX installation is</w:t>
+      </w:r>
+      <w:r>
+        <w:rPr>
+          <w:rFonts w:asciiTheme="minorBidi" w:hAnsiTheme="minorBidi" w:cstheme="minorBidi"/>
+          <w:sz w:val="24"/>
+          <w:szCs w:val="24"/>
+        </w:rPr>
+        <w:t xml:space="preserve"> </w:t>
+      </w:r>
+      <w:r>
+        <w:rPr>
+          <w:rFonts w:asciiTheme="minorBidi" w:hAnsiTheme="minorBidi" w:cstheme="minorBidi"/>
+          <w:sz w:val="24"/>
+          <w:szCs w:val="24"/>
+        </w:rPr>
+        <w:t xml:space="preserve">required </w:t>
+      </w:r>
+      <w:r>
+        <w:rPr>
+          <w:rFonts w:asciiTheme="minorBidi" w:hAnsiTheme="minorBidi" w:cstheme="minorBidi"/>
+          <w:sz w:val="24"/>
+          <w:szCs w:val="24"/>
+        </w:rPr>
+        <w:t>on the machine that runs it</w:t>
+      </w:r>
+      <w:r>
+        <w:rPr>
+          <w:rFonts w:asciiTheme="minorBidi" w:hAnsiTheme="minorBidi" w:cstheme="minorBidi"/>
+          <w:sz w:val="24"/>
+          <w:szCs w:val="24"/>
+        </w:rPr>
+        <w:t xml:space="preserve">. A JavaFX runtime (SDK 25.0.4 - its lib and bin folders, including the native binaries) is bundled inside the submission under </w:t>
+      </w:r>
+      <w:proofErr w:type="spellStart"/>
+      <w:r>
+        <w:rPr>
+          <w:rFonts w:asciiTheme="minorBidi" w:hAnsiTheme="minorBidi" w:cstheme="minorBidi"/>
+          <w:sz w:val="24"/>
+          <w:szCs w:val="24"/>
+        </w:rPr>
+        <w:t>javafx</w:t>
+      </w:r>
+      <w:proofErr w:type="spellEnd"/>
+      <w:r>
+        <w:rPr>
+          <w:rFonts w:asciiTheme="minorBidi" w:hAnsiTheme="minorBidi" w:cstheme="minorBidi"/>
+          <w:sz w:val="24"/>
+          <w:szCs w:val="24"/>
+        </w:rPr>
+        <w:t xml:space="preserve">-runtime. run.bat first attempts a plain </w:t>
+      </w:r>
+      <w:proofErr w:type="spellStart"/>
+      <w:r>
+        <w:rPr>
+          <w:rFonts w:asciiTheme="minorBidi" w:hAnsiTheme="minorBidi" w:cstheme="minorBidi"/>
+          <w:sz w:val="24"/>
+          <w:szCs w:val="24"/>
+        </w:rPr>
+        <w:t>classpath</w:t>
+      </w:r>
+      <w:proofErr w:type="spellEnd"/>
+      <w:r>
+        <w:rPr>
+          <w:rFonts w:asciiTheme="minorBidi" w:hAnsiTheme="minorBidi" w:cstheme="minorBidi"/>
+          <w:sz w:val="24"/>
+          <w:szCs w:val="24"/>
+        </w:rPr>
+        <w:t xml:space="preserve"> launch, and if that fails it relaunches with --module-path </w:t>
+      </w:r>
+      <w:proofErr w:type="spellStart"/>
+      <w:r>
+        <w:rPr>
+          <w:rFonts w:asciiTheme="minorBidi" w:hAnsiTheme="minorBidi" w:cstheme="minorBidi"/>
+          <w:sz w:val="24"/>
+          <w:szCs w:val="24"/>
+        </w:rPr>
+        <w:t>javafx</w:t>
+      </w:r>
+      <w:proofErr w:type="spellEnd"/>
+      <w:r>
+        <w:rPr>
+          <w:rFonts w:asciiTheme="minorBidi" w:hAnsiTheme="minorBidi" w:cstheme="minorBidi"/>
+          <w:sz w:val="24"/>
+          <w:szCs w:val="24"/>
+        </w:rPr>
+        <w:t xml:space="preserve">-runtime\lib and --add-modules, so it </w:t>
+      </w:r>
+      <w:r>
+        <w:rPr>
+          <w:rFonts w:asciiTheme="minorBidi" w:hAnsiTheme="minorBidi" w:cstheme="minorBidi"/>
+          <w:sz w:val="24"/>
+          <w:szCs w:val="24"/>
+        </w:rPr>
+        <w:lastRenderedPageBreak/>
+        <w:t>works both on machines that already have JavaFX available and on machines that do not.</w:t>
+      </w:r>
+    </w:p>
+    <w:p>
+      <w:pPr>
+        <w:spacing w:after="120"/>
+        <w:rPr>
+          <w:rFonts w:asciiTheme="minorBidi" w:hAnsiTheme="minorBidi" w:cstheme="minorBidi"/>
+          <w:sz w:val="24"/>
+          <w:szCs w:val="24"/>
+        </w:rPr>
+      </w:pPr>
+      <w:r>
+        <w:rPr>
+          <w:rFonts w:asciiTheme="minorBidi" w:hAnsiTheme="minorBidi" w:cstheme="minorBidi"/>
+          <w:sz w:val="24"/>
+          <w:szCs w:val="24"/>
+        </w:rPr>
+        <w:t xml:space="preserve">The submitted zip is self-contained: engine.jar, ui.jar, run.bat and </w:t>
+      </w:r>
+      <w:proofErr w:type="spellStart"/>
+      <w:r>
+        <w:rPr>
+          <w:rFonts w:asciiTheme="minorBidi" w:hAnsiTheme="minorBidi" w:cstheme="minorBidi"/>
+          <w:sz w:val="24"/>
+          <w:szCs w:val="24"/>
+        </w:rPr>
+        <w:t>javafx</w:t>
+      </w:r>
+      <w:proofErr w:type="spellEnd"/>
+      <w:r>
+        <w:rPr>
+          <w:rFonts w:asciiTheme="minorBidi" w:hAnsiTheme="minorBidi" w:cstheme="minorBidi"/>
+          <w:sz w:val="24"/>
+          <w:szCs w:val="24"/>
+        </w:rPr>
+        <w:t>-runtime must be kept together in the same folder. Verified end-to-end from a clean extracted folder outside the IDE.</w:t>
+      </w:r>
+    </w:p>
+    <w:p>
+      <w:pPr>
         <w:spacing w:after="60"/>
         <w:rPr>
           <w:rFonts w:asciiTheme="minorBidi" w:hAnsiTheme="minorBidi" w:cstheme="minorBidi"/>
@@ -2437,38 +2963,6 @@
           <w:szCs w:val="24"/>
         </w:rPr>
       </w:pPr>
-      <w:r>
-        <w:rPr>
-          <w:rFonts w:asciiTheme="minorBidi" w:hAnsiTheme="minorBidi" w:cstheme="minorBidi"/>
-          <w:sz w:val="24"/>
-          <w:szCs w:val="24"/>
-        </w:rPr>
-        <w:lastRenderedPageBreak/>
-        <w:t>Resize behavior, ScrollPanes on every screen, and small-window testing still need a final pass tomorrow.</w:t>
-      </w:r>
-    </w:p>
-    <w:p>
-      <w:pPr>
-        <w:pStyle w:val="ListParagraph"/>
-        <w:numPr>
-          <w:ilvl w:val="0"/>
-          <w:numId w:val="2"/>
-        </w:numPr>
-        <w:spacing w:after="60"/>
-        <w:rPr>
-          <w:rFonts w:asciiTheme="minorBidi" w:hAnsiTheme="minorBidi" w:cstheme="minorBidi"/>
-          <w:sz w:val="24"/>
-          <w:szCs w:val="24"/>
-        </w:rPr>
-      </w:pPr>
-      <w:r>
-        <w:rPr>
-          <w:rFonts w:asciiTheme="minorBidi" w:hAnsiTheme="minorBidi" w:cstheme="minorBidi"/>
-          <w:sz w:val="24"/>
-          <w:szCs w:val="24"/>
-        </w:rPr>
-        <w:t>The “charts” bonus (price-over-time / balance-over-time graphs) was not attempted, by choice, given the time available.</w:t>
-      </w:r>
     </w:p>
     <w:sectPr>
       <w:pgSz w:w="12240" w:h="15840"/>
@@ -2483,6 +2977,60 @@
 <file path=word/numbering.xml><?xml version="1.0" encoding="utf-8"?>
 <w:numbering xmlns:wpc="http://schemas.microsoft.com/office/word/2010/wordprocessingCanvas" xmlns:cx="http://schemas.microsoft.com/office/drawing/2014/chartex" xmlns:cx1="http://schemas.microsoft.com/office/drawing/2015/9/8/chartex" xmlns:cx2="http://schemas.microsoft.com/office/drawing/2015/10/21/chartex" xmlns:cx3="http://schemas.microsoft.com/office/drawing/2016/5/9/chartex" xmlns:cx4="http://schemas.microsoft.com/office/drawing/2016/5/10/chartex" xmlns:cx5="http://schemas.microsoft.com/office/drawing/2016/5/11/chartex" xmlns:cx6="http://schemas.microsoft.com/office/drawing/2016/5/12/chartex" xmlns:cx7="http://schemas.microsoft.com/office/drawing/2016/5/13/chartex" xmlns:cx8="http://schemas.microsoft.com/office/drawing/2016/5/14/chartex" xmlns:mc="http://schemas.openxmlformats.org/markup-compatibility/2006" xmlns:aink="http://schemas.microsoft.com/office/drawing/2016/ink" xmlns:am3d="http://schemas.microsoft.com/office/drawing/2017/model3d" xmlns:o="urn:schemas-microsoft-com:office:office" xmlns:oel="http://schemas.microsoft.com/office/2019/extlst" xmlns:r="http://schemas.openxmlformats.org/officeDocument/2006/relationships" xmlns:m="http://schemas.openxmlformats.org/officeDocument/2006/math" xmlns:v="urn:schemas-microsoft-com:vml" xmlns:wp14="http://schemas.microsoft.com/office/word/2010/wordprocessingDrawing" xmlns:wp="http://schemas.openxmlformats.org/drawingml/2006/wordprocessingDrawing" xmlns:w10="urn:schemas-microsoft-com:office:word" xmlns:w="http://schemas.openxmlformats.org/wordprocessingml/2006/main" xmlns:w14="http://schemas.microsoft.com/office/word/2010/wordml" xmlns:w15="http://schemas.microsoft.com/office/word/2012/wordml" xmlns:w16cei="http://schemas.microsoft.com/office/word/2026/wordml/cei" xmlns:w16cex="http://schemas.microsoft.com/office/word/2018/wordml/cex" xmlns:w16cid="http://schemas.microsoft.com/office/word/2016/wordml/cid" xmlns:w16="http://schemas.microsoft.com/office/word/2018/wordml" xmlns:w16du="http://schemas.microsoft.com/office/word/2023/wordml/word16du" xmlns:w16sdtdh="http://schemas.microsoft.com/office/word/2020/wordml/sdtdatahash" xmlns:w16sdtfl="http://schemas.microsoft.com/office/word/2024/wordml/sdtformatlock" xmlns:w16se="http://schemas.microsoft.com/office/word/2015/wordml/symex" xmlns:wpg="http://schemas.microsoft.com/office/word/2010/wordprocessingGroup" xmlns:wpi="http://schemas.microsoft.com/office/word/2010/wordprocessingInk" xmlns:wne="http://schemas.microsoft.com/office/word/2006/wordml" xmlns:wps="http://schemas.microsoft.com/office/word/2010/wordprocessingShape" mc:Ignorable="w14 w15 w16se w16cid w16 w16cex w16sdtdh w16sdtfl w16du wp14">
   <w:abstractNum w:abstractNumId="0" w15:restartNumberingAfterBreak="0">
+    <w:nsid w:val="10342BF5"/>
+    <w:multiLevelType w:val="hybridMultilevel"/>
+    <w:tmpl w:val="10342BF6"/>
+    <w:lvl w:ilvl="0" w:tplc="10342BF7">
+      <w:start w:val="1"/>
+      <w:numFmt w:val="decimal"/>
+      <w:lvlText w:val="%1."/>
+      <w:lvlJc w:val="left"/>
+      <w:pPr>
+        <w:ind w:left="720" w:hanging="360"/>
+      </w:pPr>
+    </w:lvl>
+    <w:lvl w:ilvl="1" w:tplc="0248DF3E">
+      <w:numFmt w:val="decimal"/>
+      <w:lvlText w:val=""/>
+      <w:lvlJc w:val="left"/>
+    </w:lvl>
+    <w:lvl w:ilvl="2" w:tplc="EE6EB5DA">
+      <w:numFmt w:val="decimal"/>
+      <w:lvlText w:val=""/>
+      <w:lvlJc w:val="left"/>
+    </w:lvl>
+    <w:lvl w:ilvl="3" w:tplc="163C782C">
+      <w:numFmt w:val="decimal"/>
+      <w:lvlText w:val=""/>
+      <w:lvlJc w:val="left"/>
+    </w:lvl>
+    <w:lvl w:ilvl="4" w:tplc="A080D8AA">
+      <w:numFmt w:val="decimal"/>
+      <w:lvlText w:val=""/>
+      <w:lvlJc w:val="left"/>
+    </w:lvl>
+    <w:lvl w:ilvl="5" w:tplc="AAA4CBD4">
+      <w:numFmt w:val="decimal"/>
+      <w:lvlText w:val=""/>
+      <w:lvlJc w:val="left"/>
+    </w:lvl>
+    <w:lvl w:ilvl="6" w:tplc="077C6766">
+      <w:numFmt w:val="decimal"/>
+      <w:lvlText w:val=""/>
+      <w:lvlJc w:val="left"/>
+    </w:lvl>
+    <w:lvl w:ilvl="7" w:tplc="28EC3E9A">
+      <w:numFmt w:val="decimal"/>
+      <w:lvlText w:val=""/>
+      <w:lvlJc w:val="left"/>
+    </w:lvl>
+    <w:lvl w:ilvl="8" w:tplc="215084FA">
+      <w:numFmt w:val="decimal"/>
+      <w:lvlText w:val=""/>
+      <w:lvlJc w:val="left"/>
+    </w:lvl>
+  </w:abstractNum>
+  <w:abstractNum w:abstractNumId="1" w15:restartNumberingAfterBreak="0">
     <w:nsid w:val="20342BF5"/>
     <w:multiLevelType w:val="hybridMultilevel"/>
     <w:tmpl w:val="3F58A3FE"/>
@@ -2568,7 +3116,7 @@
       </w:pPr>
     </w:lvl>
   </w:abstractNum>
-  <w:abstractNum w:abstractNumId="1" w15:restartNumberingAfterBreak="0">
+  <w:abstractNum w:abstractNumId="2" w15:restartNumberingAfterBreak="0">
     <w:nsid w:val="4A4A2CF4"/>
     <w:multiLevelType w:val="hybridMultilevel"/>
     <w:tmpl w:val="6ECE3D42"/>
@@ -2622,7 +3170,7 @@
       <w:lvlJc w:val="left"/>
     </w:lvl>
   </w:abstractNum>
-  <w:abstractNum w:abstractNumId="2" w15:restartNumberingAfterBreak="0">
+  <w:abstractNum w:abstractNumId="3" w15:restartNumberingAfterBreak="0">
     <w:nsid w:val="71B9132B"/>
     <w:multiLevelType w:val="hybridMultilevel"/>
     <w:tmpl w:val="0A885A4C"/>
@@ -2709,22 +3257,39 @@
     </w:lvl>
   </w:abstractNum>
   <w:num w:numId="1" w16cid:durableId="793138651">
+    <w:abstractNumId w:val="3"/>
+    <w:lvlOverride w:ilvl="0">
+      <w:startOverride w:val="1"/>
+    </w:lvlOverride>
+  </w:num>
+  <w:num w:numId="2" w16cid:durableId="1415780812">
     <w:abstractNumId w:val="2"/>
     <w:lvlOverride w:ilvl="0">
       <w:startOverride w:val="1"/>
     </w:lvlOverride>
   </w:num>
-  <w:num w:numId="2" w16cid:durableId="1415780812">
+  <w:num w:numId="3" w16cid:durableId="1986466535">
     <w:abstractNumId w:val="1"/>
     <w:lvlOverride w:ilvl="0">
       <w:startOverride w:val="1"/>
     </w:lvlOverride>
   </w:num>
-  <w:num w:numId="3" w16cid:durableId="1986466535">
+  <w:num w:numId="4" w16cid:durableId="1376537734">
+    <w:abstractNumId w:val="0"/>
+  </w:num>
+  <w:num w:numId="5" w16cid:durableId="1426808912">
     <w:abstractNumId w:val="0"/>
     <w:lvlOverride w:ilvl="0">
       <w:startOverride w:val="1"/>
     </w:lvlOverride>
+    <w:lvlOverride w:ilvl="1"/>
+    <w:lvlOverride w:ilvl="2"/>
+    <w:lvlOverride w:ilvl="3"/>
+    <w:lvlOverride w:ilvl="4"/>
+    <w:lvlOverride w:ilvl="5"/>
+    <w:lvlOverride w:ilvl="6"/>
+    <w:lvlOverride w:ilvl="7"/>
+    <w:lvlOverride w:ilvl="8"/>
   </w:num>
 </w:numbering>
 </file>
@@ -3208,6 +3773,7 @@
   <w:style w:type="character" w:default="1" w:styleId="DefaultParagraphFont">
     <w:name w:val="Default Paragraph Font"/>
     <w:uiPriority w:val="1"/>
+    <w:semiHidden/>
     <w:unhideWhenUsed/>
   </w:style>
   <w:style w:type="table" w:default="1" w:styleId="TableNormal">

</xml_diff>